<commit_message>
docs: biller-agg v1.2 standar industri lengkap (System Requirements, Install, Roles, Glossary, Safety, FAQ, Index) 19K md 46K docx
</commit_message>
<xml_diff>
--- a/docs/user-guide/biller-agg.docx
+++ b/docs/user-guide/biller-agg.docx
@@ -103,7 +103,7 @@
         <w:rPr>
           <w:sz w:val="18"/>
         </w:rPr>
-        <w:t xml:space="preserve"> 1.0 | </w:t>
+        <w:t xml:space="preserve"> 1.2 | </w:t>
       </w:r>
       <w:r>
         <w:rPr>
@@ -116,7 +116,7 @@
         <w:rPr>
           <w:sz w:val="18"/>
         </w:rPr>
-        <w:t xml:space="preserve"> 28-08-2026 | </w:t>
+        <w:t xml:space="preserve"> 17-09-2026 | </w:t>
       </w:r>
       <w:r>
         <w:rPr>
@@ -455,6 +455,80 @@
           </w:p>
         </w:tc>
       </w:tr>
+      <w:tr>
+        <w:tc>
+          <w:tcPr>
+            <w:tcW w:type="dxa" w:w="2628"/>
+            <w:vAlign w:val="center"/>
+          </w:tcPr>
+          <w:p>
+            <w:pPr>
+              <w:spacing w:after="40"/>
+              <w:jc w:val="center"/>
+            </w:pPr>
+            <w:r>
+              <w:rPr>
+                <w:sz w:val="14"/>
+              </w:rPr>
+              <w:t>1.2</w:t>
+            </w:r>
+          </w:p>
+        </w:tc>
+        <w:tc>
+          <w:tcPr>
+            <w:tcW w:type="dxa" w:w="2628"/>
+            <w:vAlign w:val="center"/>
+          </w:tcPr>
+          <w:p>
+            <w:pPr>
+              <w:spacing w:after="40"/>
+              <w:jc w:val="center"/>
+            </w:pPr>
+            <w:r>
+              <w:rPr>
+                <w:sz w:val="14"/>
+              </w:rPr>
+              <w:t>17-09-2026</w:t>
+            </w:r>
+          </w:p>
+        </w:tc>
+        <w:tc>
+          <w:tcPr>
+            <w:tcW w:type="dxa" w:w="2628"/>
+            <w:vAlign w:val="center"/>
+          </w:tcPr>
+          <w:p>
+            <w:pPr>
+              <w:spacing w:after="40"/>
+              <w:jc w:val="center"/>
+            </w:pPr>
+            <w:r>
+              <w:rPr>
+                <w:sz w:val="14"/>
+              </w:rPr>
+              <w:t>QA Automation Kickstarter</w:t>
+            </w:r>
+          </w:p>
+        </w:tc>
+        <w:tc>
+          <w:tcPr>
+            <w:tcW w:type="dxa" w:w="2628"/>
+            <w:vAlign w:val="center"/>
+          </w:tcPr>
+          <w:p>
+            <w:pPr>
+              <w:spacing w:after="40"/>
+              <w:jc w:val="center"/>
+            </w:pPr>
+            <w:r>
+              <w:rPr>
+                <w:sz w:val="14"/>
+              </w:rPr>
+              <w:t>Standar industri: tambah System Requirements, Install, Glossary, Roles, Safety, FAQ, Index</w:t>
+            </w:r>
+          </w:p>
+        </w:tc>
+      </w:tr>
     </w:tbl>
     <w:p>
       <w:pPr>
@@ -501,7 +575,7 @@
         <w:rPr>
           <w:sz w:val="18"/>
         </w:rPr>
-        <w:t>[Prasyarat](#2-prasyarat)</w:t>
+        <w:t>[Prasyarat &amp; System Requirements](#2-prasyarat--system-requirements)</w:t>
       </w:r>
     </w:p>
     <w:p>
@@ -512,7 +586,7 @@
         <w:rPr>
           <w:sz w:val="18"/>
         </w:rPr>
-        <w:t>[Akses &amp; Login Flow](#3-akses--login-flow)</w:t>
+        <w:t>[Instalasi &amp; Setup](#3-instalasi--setup)</w:t>
       </w:r>
     </w:p>
     <w:p>
@@ -523,7 +597,7 @@
         <w:rPr>
           <w:sz w:val="18"/>
         </w:rPr>
-        <w:t>[Struktur Menu](#4-struktur-menu)</w:t>
+        <w:t>[Akses &amp; Login Flow](#4-akses--login-flow)</w:t>
       </w:r>
     </w:p>
     <w:p>
@@ -534,7 +608,7 @@
         <w:rPr>
           <w:sz w:val="18"/>
         </w:rPr>
-        <w:t>[Flowchart Umum](#5-flowchart-umum)</w:t>
+        <w:t>[Roles &amp; Permissions](#5-roles--permissions)</w:t>
       </w:r>
     </w:p>
     <w:p>
@@ -545,7 +619,29 @@
         <w:rPr>
           <w:sz w:val="18"/>
         </w:rPr>
-        <w:t>[Detail Fitur per Menu](#6-detail-fitur-per-menu)</w:t>
+        <w:t>[Struktur Menu](#6-struktur-menu)</w:t>
+      </w:r>
+    </w:p>
+    <w:p>
+      <w:pPr>
+        <w:pStyle w:val="ListNumber"/>
+      </w:pPr>
+      <w:r>
+        <w:rPr>
+          <w:sz w:val="18"/>
+        </w:rPr>
+        <w:t>[Flowchart Umum](#7-flowchart-umum)</w:t>
+      </w:r>
+    </w:p>
+    <w:p>
+      <w:pPr>
+        <w:pStyle w:val="ListNumber"/>
+      </w:pPr>
+      <w:r>
+        <w:rPr>
+          <w:sz w:val="18"/>
+        </w:rPr>
+        <w:t>[Detail Fitur per Menu](#8-detail-fitur-per-menu)</w:t>
       </w:r>
     </w:p>
     <w:p>
@@ -556,7 +652,7 @@
         <w:rPr>
           <w:sz w:val="18"/>
         </w:rPr>
-        <w:t xml:space="preserve">   - 6.1 Dashboard</w:t>
+        <w:t xml:space="preserve">   - 8.1 Dashboard</w:t>
       </w:r>
     </w:p>
     <w:p>
@@ -567,7 +663,7 @@
         <w:rPr>
           <w:sz w:val="18"/>
         </w:rPr>
-        <w:t xml:space="preserve">   - 6.2 Bank</w:t>
+        <w:t xml:space="preserve">   - 8.2 Bank</w:t>
       </w:r>
     </w:p>
     <w:p>
@@ -578,7 +674,7 @@
         <w:rPr>
           <w:sz w:val="18"/>
         </w:rPr>
-        <w:t xml:space="preserve">   - 6.3 Billing Provider</w:t>
+        <w:t xml:space="preserve">   - 8.3 Billing Provider</w:t>
       </w:r>
     </w:p>
     <w:p>
@@ -589,7 +685,7 @@
         <w:rPr>
           <w:sz w:val="18"/>
         </w:rPr>
-        <w:t xml:space="preserve">   - 6.4 Kategori &amp; Grup</w:t>
+        <w:t xml:space="preserve">   - 8.4 Kategori &amp; Grup</w:t>
       </w:r>
     </w:p>
     <w:p>
@@ -600,7 +696,7 @@
         <w:rPr>
           <w:sz w:val="18"/>
         </w:rPr>
-        <w:t xml:space="preserve">   - 6.5 Menu</w:t>
+        <w:t xml:space="preserve">   - 8.5 Menu</w:t>
       </w:r>
     </w:p>
     <w:p>
@@ -611,7 +707,7 @@
         <w:rPr>
           <w:sz w:val="18"/>
         </w:rPr>
-        <w:t xml:space="preserve">   - 6.6 Mitra</w:t>
+        <w:t xml:space="preserve">   - 8.6 Mitra</w:t>
       </w:r>
     </w:p>
     <w:p>
@@ -622,7 +718,7 @@
         <w:rPr>
           <w:sz w:val="18"/>
         </w:rPr>
-        <w:t xml:space="preserve">   - 6.7 Mitra Sub-menu (Top Up, Riwayat, Product Pricing, Credential)</w:t>
+        <w:t xml:space="preserve">   - 8.7 Mitra Sub-menu (Top Up, Riwayat, Product Pricing, Credential)</w:t>
       </w:r>
     </w:p>
     <w:p>
@@ -633,7 +729,7 @@
         <w:rPr>
           <w:sz w:val="18"/>
         </w:rPr>
-        <w:t xml:space="preserve">   - 6.8 Manage Product</w:t>
+        <w:t xml:space="preserve">   - 8.8 Manage Product</w:t>
       </w:r>
     </w:p>
     <w:p>
@@ -644,7 +740,7 @@
         <w:rPr>
           <w:sz w:val="18"/>
         </w:rPr>
-        <w:t xml:space="preserve">   - 6.9 Manage Role</w:t>
+        <w:t xml:space="preserve">   - 8.9 Manage Role</w:t>
       </w:r>
     </w:p>
     <w:p>
@@ -655,7 +751,7 @@
         <w:rPr>
           <w:sz w:val="18"/>
         </w:rPr>
-        <w:t xml:space="preserve">   - 6.10 Monitoring Transaksi</w:t>
+        <w:t xml:space="preserve">   - 8.10 Monitoring Transaksi</w:t>
       </w:r>
     </w:p>
     <w:p>
@@ -666,7 +762,7 @@
         <w:rPr>
           <w:sz w:val="18"/>
         </w:rPr>
-        <w:t xml:space="preserve">   - 6.11 Rekap Transaksi</w:t>
+        <w:t xml:space="preserve">   - 8.11 Rekap Transaksi</w:t>
       </w:r>
     </w:p>
     <w:p>
@@ -677,7 +773,7 @@
         <w:rPr>
           <w:sz w:val="18"/>
         </w:rPr>
-        <w:t xml:space="preserve">   - 6.12 Rekonsiliasi</w:t>
+        <w:t xml:space="preserve">   - 8.12 Rekonsiliasi</w:t>
       </w:r>
     </w:p>
     <w:p>
@@ -688,7 +784,7 @@
         <w:rPr>
           <w:sz w:val="18"/>
         </w:rPr>
-        <w:t xml:space="preserve">   - 6.13 Invoice</w:t>
+        <w:t xml:space="preserve">   - 8.13 Invoice</w:t>
       </w:r>
     </w:p>
     <w:p>
@@ -699,7 +795,7 @@
         <w:rPr>
           <w:sz w:val="18"/>
         </w:rPr>
-        <w:t>[Validasi &amp; Negative Cases (Sesi Khusus)](#7-validasi--negative-cases-sesi-khusus)</w:t>
+        <w:t>[Validasi &amp; Negative Cases (Sesi Khusus)](#9-validasi--negative-cases-sesi-khusus)</w:t>
       </w:r>
     </w:p>
     <w:p>
@@ -710,7 +806,7 @@
         <w:rPr>
           <w:sz w:val="18"/>
         </w:rPr>
-        <w:t>[Data Test &amp; Cleanup](#8-data-test--cleanup)</w:t>
+        <w:t>[Glossary](#10-glossary)</w:t>
       </w:r>
     </w:p>
     <w:p>
@@ -721,7 +817,7 @@
         <w:rPr>
           <w:sz w:val="18"/>
         </w:rPr>
-        <w:t>[Troubleshooting](#9-troubleshooting)</w:t>
+        <w:t>[Safety &amp; Warnings](#11-safety--warnings)</w:t>
       </w:r>
     </w:p>
     <w:p>
@@ -732,7 +828,7 @@
         <w:rPr>
           <w:sz w:val="18"/>
         </w:rPr>
-        <w:t>[Catatan Temuan](#10-catatan-temuan)</w:t>
+        <w:t>[FAQ](#12-faq)</w:t>
       </w:r>
     </w:p>
     <w:p>
@@ -743,7 +839,40 @@
         <w:rPr>
           <w:sz w:val="18"/>
         </w:rPr>
-        <w:t>[Lampiran](#11-lampiran)</w:t>
+        <w:t>[Data Test &amp; Cleanup](#13-data-test--cleanup)</w:t>
+      </w:r>
+    </w:p>
+    <w:p>
+      <w:pPr>
+        <w:pStyle w:val="ListNumber"/>
+      </w:pPr>
+      <w:r>
+        <w:rPr>
+          <w:sz w:val="18"/>
+        </w:rPr>
+        <w:t>[Troubleshooting](#14-troubleshooting)</w:t>
+      </w:r>
+    </w:p>
+    <w:p>
+      <w:pPr>
+        <w:pStyle w:val="ListNumber"/>
+      </w:pPr>
+      <w:r>
+        <w:rPr>
+          <w:sz w:val="18"/>
+        </w:rPr>
+        <w:t>[Catatan Temuan](#15-catatan-temuan)</w:t>
+      </w:r>
+    </w:p>
+    <w:p>
+      <w:pPr>
+        <w:pStyle w:val="ListNumber"/>
+      </w:pPr>
+      <w:r>
+        <w:rPr>
+          <w:sz w:val="18"/>
+        </w:rPr>
+        <w:t>[Lampiran &amp; Index](#16-lampiran--index)</w:t>
       </w:r>
     </w:p>
     <w:p>
@@ -817,6 +946,29 @@
           <w:sz w:val="18"/>
         </w:rPr>
         <w:t>.</w:t>
+      </w:r>
+    </w:p>
+    <w:p>
+      <w:pPr>
+        <w:spacing w:after="80"/>
+      </w:pPr>
+      <w:r>
+        <w:rPr>
+          <w:sz w:val="18"/>
+        </w:rPr>
+      </w:r>
+      <w:r>
+        <w:rPr>
+          <w:b/>
+          <w:sz w:val="18"/>
+        </w:rPr>
+        <w:t>Tujuan User Manual (ISO/IEC 26514:2022):</w:t>
+      </w:r>
+      <w:r>
+        <w:rPr>
+          <w:sz w:val="18"/>
+        </w:rPr>
+        <w:t xml:space="preserve"> Memberikan instruksi lengkap instalasi, pengoperasian, dan pemeliharaan untuk end-user (Admin, Finance, Ops) dan QA.</w:t>
       </w:r>
     </w:p>
     <w:p>
@@ -936,6 +1088,29 @@
     </w:p>
     <w:p>
       <w:pPr>
+        <w:spacing w:after="80"/>
+      </w:pPr>
+      <w:r>
+        <w:rPr>
+          <w:sz w:val="18"/>
+        </w:rPr>
+      </w:r>
+      <w:r>
+        <w:rPr>
+          <w:b/>
+          <w:sz w:val="18"/>
+        </w:rPr>
+        <w:t>Audience:</w:t>
+      </w:r>
+      <w:r>
+        <w:rPr>
+          <w:sz w:val="18"/>
+        </w:rPr>
+        <w:t xml:space="preserve"> Admin BA, QA, Dev, Finance Ops.</w:t>
+      </w:r>
+    </w:p>
+    <w:p>
+      <w:pPr>
         <w:pBdr>
           <w:bottom w:val="single" w:sz="6" w:space="1" w:color="A0A0A0"/>
         </w:pBdr>
@@ -952,7 +1127,7 @@
           <w:color w:val="2E75B5"/>
           <w:sz w:val="24"/>
         </w:rPr>
-        <w:t>2. Prasyarat</w:t>
+        <w:t>2. Prasyarat &amp; System Requirements</w:t>
       </w:r>
     </w:p>
     <w:tbl>
@@ -986,7 +1161,7 @@
                 <w:color w:val="FFFFFF"/>
                 <w:sz w:val="16"/>
               </w:rPr>
-              <w:t>Item</w:t>
+              <w:t>Kategori</w:t>
             </w:r>
           </w:p>
         </w:tc>
@@ -1007,7 +1182,7 @@
                 <w:color w:val="FFFFFF"/>
                 <w:sz w:val="16"/>
               </w:rPr>
-              <w:t>Value</w:t>
+              <w:t>Requirement</w:t>
             </w:r>
           </w:p>
         </w:tc>
@@ -1028,7 +1203,7 @@
                 <w:color w:val="FFFFFF"/>
                 <w:sz w:val="16"/>
               </w:rPr>
-              <w:t>File</w:t>
+              <w:t>Detail</w:t>
             </w:r>
           </w:p>
         </w:tc>
@@ -1365,6 +1540,230 @@
                 <w:sz w:val="14"/>
               </w:rPr>
               <w:t>`shared/pages/BaPage.ts:17`</w:t>
+            </w:r>
+          </w:p>
+        </w:tc>
+      </w:tr>
+      <w:tr>
+        <w:tc>
+          <w:tcPr>
+            <w:tcW w:type="dxa" w:w="3504"/>
+            <w:vAlign w:val="center"/>
+          </w:tcPr>
+          <w:p>
+            <w:pPr>
+              <w:spacing w:after="40"/>
+              <w:jc w:val="center"/>
+            </w:pPr>
+            <w:r>
+              <w:rPr>
+                <w:sz w:val="14"/>
+              </w:rPr>
+              <w:t>**OS**</w:t>
+            </w:r>
+          </w:p>
+        </w:tc>
+        <w:tc>
+          <w:tcPr>
+            <w:tcW w:type="dxa" w:w="3504"/>
+            <w:vAlign w:val="center"/>
+          </w:tcPr>
+          <w:p>
+            <w:pPr>
+              <w:spacing w:after="40"/>
+              <w:jc w:val="center"/>
+            </w:pPr>
+            <w:r>
+              <w:rPr>
+                <w:sz w:val="14"/>
+              </w:rPr>
+              <w:t>Windows 10/11, macOS 13+, Linux Ubuntu 22.04+</w:t>
+            </w:r>
+          </w:p>
+        </w:tc>
+        <w:tc>
+          <w:tcPr>
+            <w:tcW w:type="dxa" w:w="3504"/>
+            <w:vAlign w:val="center"/>
+          </w:tcPr>
+          <w:p>
+            <w:pPr>
+              <w:spacing w:after="40"/>
+              <w:jc w:val="center"/>
+            </w:pPr>
+            <w:r>
+              <w:rPr>
+                <w:sz w:val="14"/>
+              </w:rPr>
+              <w:t>Browser Chrome 120+, Firefox 120+, WebKit 17+</w:t>
+            </w:r>
+          </w:p>
+        </w:tc>
+      </w:tr>
+      <w:tr>
+        <w:tc>
+          <w:tcPr>
+            <w:tcW w:type="dxa" w:w="3504"/>
+            <w:vAlign w:val="center"/>
+          </w:tcPr>
+          <w:p>
+            <w:pPr>
+              <w:spacing w:after="40"/>
+              <w:jc w:val="center"/>
+            </w:pPr>
+            <w:r>
+              <w:rPr>
+                <w:sz w:val="14"/>
+              </w:rPr>
+              <w:t>**Browser**</w:t>
+            </w:r>
+          </w:p>
+        </w:tc>
+        <w:tc>
+          <w:tcPr>
+            <w:tcW w:type="dxa" w:w="3504"/>
+            <w:vAlign w:val="center"/>
+          </w:tcPr>
+          <w:p>
+            <w:pPr>
+              <w:spacing w:after="40"/>
+              <w:jc w:val="center"/>
+            </w:pPr>
+            <w:r>
+              <w:rPr>
+                <w:sz w:val="14"/>
+              </w:rPr>
+              <w:t>Chrome/Edge 120+ (Playwright `Desktop Chrome`)</w:t>
+            </w:r>
+          </w:p>
+        </w:tc>
+        <w:tc>
+          <w:tcPr>
+            <w:tcW w:type="dxa" w:w="3504"/>
+            <w:vAlign w:val="center"/>
+          </w:tcPr>
+          <w:p>
+            <w:pPr>
+              <w:spacing w:after="40"/>
+              <w:jc w:val="center"/>
+            </w:pPr>
+            <w:r>
+              <w:rPr>
+                <w:sz w:val="14"/>
+              </w:rPr>
+              <w:t>`devices['Desktop Chrome']` `playwright.config.ts:77`</w:t>
+            </w:r>
+          </w:p>
+        </w:tc>
+      </w:tr>
+      <w:tr>
+        <w:tc>
+          <w:tcPr>
+            <w:tcW w:type="dxa" w:w="3504"/>
+            <w:vAlign w:val="center"/>
+          </w:tcPr>
+          <w:p>
+            <w:pPr>
+              <w:spacing w:after="40"/>
+              <w:jc w:val="center"/>
+            </w:pPr>
+            <w:r>
+              <w:rPr>
+                <w:sz w:val="14"/>
+              </w:rPr>
+              <w:t>**Network**</w:t>
+            </w:r>
+          </w:p>
+        </w:tc>
+        <w:tc>
+          <w:tcPr>
+            <w:tcW w:type="dxa" w:w="3504"/>
+            <w:vAlign w:val="center"/>
+          </w:tcPr>
+          <w:p>
+            <w:pPr>
+              <w:spacing w:after="40"/>
+              <w:jc w:val="center"/>
+            </w:pPr>
+            <w:r>
+              <w:rPr>
+                <w:sz w:val="14"/>
+              </w:rPr>
+              <w:t>10 Mbps, port 443, akses `*.lentera-app.id`</w:t>
+            </w:r>
+          </w:p>
+        </w:tc>
+        <w:tc>
+          <w:tcPr>
+            <w:tcW w:type="dxa" w:w="3504"/>
+            <w:vAlign w:val="center"/>
+          </w:tcPr>
+          <w:p>
+            <w:pPr>
+              <w:spacing w:after="40"/>
+              <w:jc w:val="center"/>
+            </w:pPr>
+            <w:r>
+              <w:rPr>
+                <w:sz w:val="14"/>
+              </w:rPr>
+              <w:t>Whitelist `iconnet-portal`, `biller-dashboard`</w:t>
+            </w:r>
+          </w:p>
+        </w:tc>
+      </w:tr>
+      <w:tr>
+        <w:tc>
+          <w:tcPr>
+            <w:tcW w:type="dxa" w:w="3504"/>
+            <w:vAlign w:val="center"/>
+          </w:tcPr>
+          <w:p>
+            <w:pPr>
+              <w:spacing w:after="40"/>
+              <w:jc w:val="center"/>
+            </w:pPr>
+            <w:r>
+              <w:rPr>
+                <w:sz w:val="14"/>
+              </w:rPr>
+              <w:t>**Resolusi**</w:t>
+            </w:r>
+          </w:p>
+        </w:tc>
+        <w:tc>
+          <w:tcPr>
+            <w:tcW w:type="dxa" w:w="3504"/>
+            <w:vAlign w:val="center"/>
+          </w:tcPr>
+          <w:p>
+            <w:pPr>
+              <w:spacing w:after="40"/>
+              <w:jc w:val="center"/>
+            </w:pPr>
+            <w:r>
+              <w:rPr>
+                <w:sz w:val="14"/>
+              </w:rPr>
+              <w:t>1366x768 min, `headless:false slowMo:1000` untuk demo</w:t>
+            </w:r>
+          </w:p>
+        </w:tc>
+        <w:tc>
+          <w:tcPr>
+            <w:tcW w:type="dxa" w:w="3504"/>
+            <w:vAlign w:val="center"/>
+          </w:tcPr>
+          <w:p>
+            <w:pPr>
+              <w:spacing w:after="40"/>
+              <w:jc w:val="center"/>
+            </w:pPr>
+            <w:r>
+              <w:rPr>
+                <w:sz w:val="14"/>
+              </w:rPr>
+              <w:t>`playwright.config.ts:81`</w:t>
             </w:r>
           </w:p>
         </w:tc>
@@ -1393,7 +1792,102 @@
           <w:color w:val="2E75B5"/>
           <w:sz w:val="24"/>
         </w:rPr>
-        <w:t>3. Akses &amp; Login Flow</w:t>
+        <w:t>3. Instalasi &amp; Setup</w:t>
+      </w:r>
+    </w:p>
+    <w:p>
+      <w:pPr>
+        <w:shd w:fill="F2F2F2" w:val="clear"/>
+        <w:spacing w:after="120"/>
+      </w:pPr>
+      <w:r>
+        <w:rPr>
+          <w:rFonts w:ascii="Consolas" w:hAnsi="Consolas"/>
+          <w:color w:val="333333"/>
+          <w:sz w:val="14"/>
+        </w:rPr>
+        <w:t>git clone https://github.com/rogo-s/Qa-Automation-Kickstarter.git</w:t>
+        <w:br/>
+        <w:t>cd Qa-Automation-Kickstarter</w:t>
+        <w:br/>
+        <w:t>npm install</w:t>
+        <w:br/>
+        <w:t>npx playwright install --with-deps chromium</w:t>
+        <w:br/>
+        <w:t>cp .env.example .env # set TEST_ENV=local</w:t>
+        <w:br/>
+        <w:t>npx playwright test --project=setup --headed # generate .auth/portal.json</w:t>
+        <w:br/>
+        <w:t>npx playwright test --project=backoffice --grep @smoke --headed</w:t>
+        <w:br/>
+        <w:t>npx tsx scripts/generate-pdf-report.ts # test-results/pdf/report-*.pdf</w:t>
+      </w:r>
+    </w:p>
+    <w:p>
+      <w:pPr>
+        <w:spacing w:after="80"/>
+      </w:pPr>
+      <w:r>
+        <w:rPr>
+          <w:sz w:val="18"/>
+        </w:rPr>
+        <w:t xml:space="preserve">*Update </w:t>
+      </w:r>
+      <w:r>
+        <w:rPr>
+          <w:rFonts w:ascii="Consolas" w:hAnsi="Consolas"/>
+          <w:color w:val="C00000"/>
+          <w:sz w:val="16"/>
+        </w:rPr>
+        <w:t>TEST_ENV=dev/staging</w:t>
+      </w:r>
+      <w:r>
+        <w:rPr>
+          <w:sz w:val="18"/>
+        </w:rPr>
+        <w:t xml:space="preserve"> untuk </w:t>
+      </w:r>
+      <w:r>
+        <w:rPr>
+          <w:rFonts w:ascii="Consolas" w:hAnsi="Consolas"/>
+          <w:color w:val="C00000"/>
+          <w:sz w:val="16"/>
+        </w:rPr>
+        <w:t>config/dev.json</w:t>
+      </w:r>
+      <w:r>
+        <w:rPr>
+          <w:sz w:val="18"/>
+        </w:rPr>
+        <w:t>.*</w:t>
+      </w:r>
+    </w:p>
+    <w:p>
+      <w:pPr>
+        <w:pBdr>
+          <w:bottom w:val="single" w:sz="6" w:space="1" w:color="A0A0A0"/>
+        </w:pBdr>
+      </w:pPr>
+    </w:p>
+    <w:p>
+      <w:pPr>
+        <w:pBdr>
+          <w:bottom w:val="single" w:sz="6" w:space="1" w:color="A0A0A0"/>
+        </w:pBdr>
+      </w:pPr>
+    </w:p>
+    <w:p>
+      <w:pPr>
+        <w:pStyle w:val="Heading2"/>
+        <w:spacing w:after="120"/>
+      </w:pPr>
+      <w:r>
+        <w:rPr>
+          <w:b/>
+          <w:color w:val="2E75B5"/>
+          <w:sz w:val="24"/>
+        </w:rPr>
+        <w:t>4. Akses &amp; Login Flow</w:t>
       </w:r>
     </w:p>
     <w:p>
@@ -1554,7 +2048,375 @@
           <w:color w:val="2E75B5"/>
           <w:sz w:val="24"/>
         </w:rPr>
-        <w:t>4. Struktur Menu</w:t>
+        <w:t>5. Roles &amp; Permissions</w:t>
+      </w:r>
+    </w:p>
+    <w:tbl>
+      <w:tblPr>
+        <w:tblStyle w:val="LightGrid-Accent1"/>
+        <w:tblW w:type="auto" w:w="0"/>
+        <w:jc w:val="center"/>
+        <w:tblLayout w:type="autofit"/>
+        <w:tblLook w:firstColumn="1" w:firstRow="1" w:lastColumn="0" w:lastRow="0" w:noHBand="0" w:noVBand="1" w:val="04A0"/>
+      </w:tblPr>
+      <w:tblGrid>
+        <w:gridCol w:w="3504"/>
+        <w:gridCol w:w="3504"/>
+        <w:gridCol w:w="3504"/>
+      </w:tblGrid>
+      <w:tr>
+        <w:tc>
+          <w:tcPr>
+            <w:tcW w:type="dxa" w:w="3504"/>
+            <w:shd w:fill="2E75B5" w:val="clear"/>
+            <w:vAlign w:val="center"/>
+          </w:tcPr>
+          <w:p>
+            <w:pPr>
+              <w:spacing w:after="40"/>
+              <w:jc w:val="center"/>
+            </w:pPr>
+            <w:r>
+              <w:rPr>
+                <w:b/>
+                <w:color w:val="FFFFFF"/>
+                <w:sz w:val="16"/>
+              </w:rPr>
+              <w:t>Role</w:t>
+            </w:r>
+          </w:p>
+        </w:tc>
+        <w:tc>
+          <w:tcPr>
+            <w:tcW w:type="dxa" w:w="3504"/>
+            <w:shd w:fill="2E75B5" w:val="clear"/>
+            <w:vAlign w:val="center"/>
+          </w:tcPr>
+          <w:p>
+            <w:pPr>
+              <w:spacing w:after="40"/>
+              <w:jc w:val="center"/>
+            </w:pPr>
+            <w:r>
+              <w:rPr>
+                <w:b/>
+                <w:color w:val="FFFFFF"/>
+                <w:sz w:val="16"/>
+              </w:rPr>
+              <w:t>Akses Menu</w:t>
+            </w:r>
+          </w:p>
+        </w:tc>
+        <w:tc>
+          <w:tcPr>
+            <w:tcW w:type="dxa" w:w="3504"/>
+            <w:shd w:fill="2E75B5" w:val="clear"/>
+            <w:vAlign w:val="center"/>
+          </w:tcPr>
+          <w:p>
+            <w:pPr>
+              <w:spacing w:after="40"/>
+              <w:jc w:val="center"/>
+            </w:pPr>
+            <w:r>
+              <w:rPr>
+                <w:b/>
+                <w:color w:val="FFFFFF"/>
+                <w:sz w:val="16"/>
+              </w:rPr>
+              <w:t>Catatan</w:t>
+            </w:r>
+          </w:p>
+        </w:tc>
+      </w:tr>
+      <w:tr>
+        <w:tc>
+          <w:tcPr>
+            <w:tcW w:type="dxa" w:w="3504"/>
+            <w:vAlign w:val="center"/>
+          </w:tcPr>
+          <w:p>
+            <w:pPr>
+              <w:spacing w:after="40"/>
+              <w:jc w:val="center"/>
+            </w:pPr>
+            <w:r>
+              <w:rPr>
+                <w:sz w:val="14"/>
+              </w:rPr>
+              <w:t>Super Admin</w:t>
+            </w:r>
+          </w:p>
+        </w:tc>
+        <w:tc>
+          <w:tcPr>
+            <w:tcW w:type="dxa" w:w="3504"/>
+            <w:vAlign w:val="center"/>
+          </w:tcPr>
+          <w:p>
+            <w:pPr>
+              <w:spacing w:after="40"/>
+              <w:jc w:val="center"/>
+            </w:pPr>
+            <w:r>
+              <w:rPr>
+                <w:sz w:val="14"/>
+              </w:rPr>
+              <w:t>Semua `Master, Transaksi, Rekonsiliasi, Invoice, Dashboard`</w:t>
+            </w:r>
+          </w:p>
+        </w:tc>
+        <w:tc>
+          <w:tcPr>
+            <w:tcW w:type="dxa" w:w="3504"/>
+            <w:vAlign w:val="center"/>
+          </w:tcPr>
+          <w:p>
+            <w:pPr>
+              <w:spacing w:after="40"/>
+              <w:jc w:val="center"/>
+            </w:pPr>
+            <w:r>
+              <w:rPr>
+                <w:sz w:val="14"/>
+              </w:rPr>
+              <w:t>Hapus Menu tetap 403 `BA-003` — perlu konfirmasi dev</w:t>
+            </w:r>
+          </w:p>
+        </w:tc>
+      </w:tr>
+      <w:tr>
+        <w:tc>
+          <w:tcPr>
+            <w:tcW w:type="dxa" w:w="3504"/>
+            <w:vAlign w:val="center"/>
+          </w:tcPr>
+          <w:p>
+            <w:pPr>
+              <w:spacing w:after="40"/>
+              <w:jc w:val="center"/>
+            </w:pPr>
+            <w:r>
+              <w:rPr>
+                <w:sz w:val="14"/>
+              </w:rPr>
+              <w:t>Admin Finance</w:t>
+            </w:r>
+          </w:p>
+        </w:tc>
+        <w:tc>
+          <w:tcPr>
+            <w:tcW w:type="dxa" w:w="3504"/>
+            <w:vAlign w:val="center"/>
+          </w:tcPr>
+          <w:p>
+            <w:pPr>
+              <w:spacing w:after="40"/>
+              <w:jc w:val="center"/>
+            </w:pPr>
+            <w:r>
+              <w:rPr>
+                <w:sz w:val="14"/>
+              </w:rPr>
+              <w:t>`Invoice (Generate, Lunas)`, `Rekap, Rekonsiliasi`</w:t>
+            </w:r>
+          </w:p>
+        </w:tc>
+        <w:tc>
+          <w:tcPr>
+            <w:tcW w:type="dxa" w:w="3504"/>
+            <w:vAlign w:val="center"/>
+          </w:tcPr>
+          <w:p>
+            <w:pPr>
+              <w:spacing w:after="40"/>
+              <w:jc w:val="center"/>
+            </w:pPr>
+            <w:r>
+              <w:rPr>
+                <w:sz w:val="14"/>
+              </w:rPr>
+              <w:t>Tidak ada `Manage Role`</w:t>
+            </w:r>
+          </w:p>
+        </w:tc>
+      </w:tr>
+      <w:tr>
+        <w:tc>
+          <w:tcPr>
+            <w:tcW w:type="dxa" w:w="3504"/>
+            <w:vAlign w:val="center"/>
+          </w:tcPr>
+          <w:p>
+            <w:pPr>
+              <w:spacing w:after="40"/>
+              <w:jc w:val="center"/>
+            </w:pPr>
+            <w:r>
+              <w:rPr>
+                <w:sz w:val="14"/>
+              </w:rPr>
+              <w:t>Ops</w:t>
+            </w:r>
+          </w:p>
+        </w:tc>
+        <w:tc>
+          <w:tcPr>
+            <w:tcW w:type="dxa" w:w="3504"/>
+            <w:vAlign w:val="center"/>
+          </w:tcPr>
+          <w:p>
+            <w:pPr>
+              <w:spacing w:after="40"/>
+              <w:jc w:val="center"/>
+            </w:pPr>
+            <w:r>
+              <w:rPr>
+                <w:sz w:val="14"/>
+              </w:rPr>
+              <w:t>`Monitoring, Rekap` view only</w:t>
+            </w:r>
+          </w:p>
+        </w:tc>
+        <w:tc>
+          <w:tcPr>
+            <w:tcW w:type="dxa" w:w="3504"/>
+            <w:vAlign w:val="center"/>
+          </w:tcPr>
+          <w:p>
+            <w:pPr>
+              <w:spacing w:after="40"/>
+              <w:jc w:val="center"/>
+            </w:pPr>
+            <w:r>
+              <w:rPr>
+                <w:sz w:val="14"/>
+              </w:rPr>
+              <w:t>`Tambah 0 view-only` untuk beberapa master</w:t>
+            </w:r>
+          </w:p>
+        </w:tc>
+      </w:tr>
+      <w:tr>
+        <w:tc>
+          <w:tcPr>
+            <w:tcW w:type="dxa" w:w="3504"/>
+            <w:vAlign w:val="center"/>
+          </w:tcPr>
+          <w:p>
+            <w:pPr>
+              <w:spacing w:after="40"/>
+              <w:jc w:val="center"/>
+            </w:pPr>
+            <w:r>
+              <w:rPr>
+                <w:sz w:val="14"/>
+              </w:rPr>
+              <w:t>Mitra</w:t>
+            </w:r>
+          </w:p>
+        </w:tc>
+        <w:tc>
+          <w:tcPr>
+            <w:tcW w:type="dxa" w:w="3504"/>
+            <w:vAlign w:val="center"/>
+          </w:tcPr>
+          <w:p>
+            <w:pPr>
+              <w:spacing w:after="40"/>
+              <w:jc w:val="center"/>
+            </w:pPr>
+            <w:r>
+              <w:rPr>
+                <w:sz w:val="14"/>
+              </w:rPr>
+              <w:t>`Top Up, Riwayat` via `Mitra Sub-menu`</w:t>
+            </w:r>
+          </w:p>
+        </w:tc>
+        <w:tc>
+          <w:tcPr>
+            <w:tcW w:type="dxa" w:w="3504"/>
+            <w:vAlign w:val="center"/>
+          </w:tcPr>
+          <w:p>
+            <w:pPr>
+              <w:spacing w:after="40"/>
+              <w:jc w:val="center"/>
+            </w:pPr>
+            <w:r>
+              <w:rPr>
+                <w:sz w:val="14"/>
+              </w:rPr>
+              <w:t>`BA-004 Mitra tidak punya Hapus`</w:t>
+            </w:r>
+          </w:p>
+        </w:tc>
+      </w:tr>
+    </w:tbl>
+    <w:p>
+      <w:pPr>
+        <w:spacing w:after="80"/>
+      </w:pPr>
+    </w:p>
+    <w:p>
+      <w:pPr>
+        <w:spacing w:after="80"/>
+      </w:pPr>
+      <w:r>
+        <w:rPr>
+          <w:sz w:val="18"/>
+        </w:rPr>
+        <w:t xml:space="preserve">*Permission matrix 115 checkbox di </w:t>
+      </w:r>
+      <w:r>
+        <w:rPr>
+          <w:rFonts w:ascii="Consolas" w:hAnsi="Consolas"/>
+          <w:color w:val="C00000"/>
+          <w:sz w:val="16"/>
+        </w:rPr>
+        <w:t>Manage Role</w:t>
+      </w:r>
+      <w:r>
+        <w:rPr>
+          <w:sz w:val="18"/>
+        </w:rPr>
+        <w:t xml:space="preserve"> </w:t>
+      </w:r>
+      <w:r>
+        <w:rPr>
+          <w:rFonts w:ascii="Consolas" w:hAnsi="Consolas"/>
+          <w:color w:val="C00000"/>
+          <w:sz w:val="16"/>
+        </w:rPr>
+        <w:t>BaRolePage</w:t>
+      </w:r>
+      <w:r>
+        <w:rPr>
+          <w:sz w:val="18"/>
+        </w:rPr>
+        <w:t>.*</w:t>
+      </w:r>
+    </w:p>
+    <w:p>
+      <w:pPr>
+        <w:pBdr>
+          <w:bottom w:val="single" w:sz="6" w:space="1" w:color="A0A0A0"/>
+        </w:pBdr>
+      </w:pPr>
+    </w:p>
+    <w:p>
+      <w:pPr>
+        <w:pStyle w:val="Heading2"/>
+        <w:spacing w:after="120"/>
+      </w:pPr>
+      <w:r>
+        <w:rPr>
+          <w:b/>
+          <w:color w:val="2E75B5"/>
+          <w:sz w:val="24"/>
+        </w:rPr>
+        <w:t>6. Struktur Menu</w:t>
       </w:r>
     </w:p>
     <w:p>
@@ -3990,7 +4852,7 @@
           <w:color w:val="2E75B5"/>
           <w:sz w:val="24"/>
         </w:rPr>
-        <w:t>5. Flowchart Umum</w:t>
+        <w:t>7. Flowchart Umum</w:t>
       </w:r>
     </w:p>
     <w:p>
@@ -4159,7 +5021,7 @@
           <w:color w:val="2E75B5"/>
           <w:sz w:val="24"/>
         </w:rPr>
-        <w:t>6. Detail Fitur per Menu</w:t>
+        <w:t>8. Detail Fitur per Menu</w:t>
       </w:r>
     </w:p>
     <w:p>
@@ -4172,7 +5034,7 @@
           <w:b/>
           <w:sz w:val="20"/>
         </w:rPr>
-        <w:t>6.1 Dashboard</w:t>
+        <w:t>8.1 Dashboard</w:t>
       </w:r>
     </w:p>
     <w:p>
@@ -4501,7 +5363,7 @@
           <w:b/>
           <w:sz w:val="20"/>
         </w:rPr>
-        <w:t>6.2 Bank</w:t>
+        <w:t>8.2 Bank</w:t>
       </w:r>
     </w:p>
     <w:p>
@@ -4968,7 +5830,7 @@
           <w:b/>
           <w:sz w:val="20"/>
         </w:rPr>
-        <w:t>6.3 Billing Provider</w:t>
+        <w:t>8.3 Billing Provider</w:t>
       </w:r>
     </w:p>
     <w:p>
@@ -5025,7 +5887,7 @@
           <w:b/>
           <w:sz w:val="20"/>
         </w:rPr>
-        <w:t>6.4 Kategori &amp; Grup</w:t>
+        <w:t>8.4 Kategori &amp; Grup</w:t>
       </w:r>
     </w:p>
     <w:p>
@@ -5071,7 +5933,7 @@
           <w:b/>
           <w:sz w:val="20"/>
         </w:rPr>
-        <w:t>6.5 Menu</w:t>
+        <w:t>8.5 Menu</w:t>
       </w:r>
     </w:p>
     <w:p>
@@ -5514,7 +6376,7 @@
           <w:b/>
           <w:sz w:val="20"/>
         </w:rPr>
-        <w:t>6.6 Mitra</w:t>
+        <w:t>8.6 Mitra</w:t>
       </w:r>
     </w:p>
     <w:p>
@@ -5582,7 +6444,7 @@
           <w:b/>
           <w:sz w:val="20"/>
         </w:rPr>
-        <w:t>6.7 Mitra Sub-menu</w:t>
+        <w:t>8.7 Mitra Sub-menu</w:t>
       </w:r>
     </w:p>
     <w:p>
@@ -5628,7 +6490,7 @@
           <w:b/>
           <w:sz w:val="20"/>
         </w:rPr>
-        <w:t>6.8 Manage Product</w:t>
+        <w:t>8.8 Manage Product</w:t>
       </w:r>
     </w:p>
     <w:p>
@@ -5685,7 +6547,7 @@
           <w:b/>
           <w:sz w:val="20"/>
         </w:rPr>
-        <w:t>6.9 Manage Role</w:t>
+        <w:t>8.9 Manage Role</w:t>
       </w:r>
     </w:p>
     <w:p>
@@ -5731,7 +6593,7 @@
           <w:b/>
           <w:sz w:val="20"/>
         </w:rPr>
-        <w:t>6.10 Monitoring Transaksi</w:t>
+        <w:t>8.10 Monitoring Transaksi</w:t>
       </w:r>
     </w:p>
     <w:p>
@@ -5766,7 +6628,7 @@
           <w:b/>
           <w:sz w:val="20"/>
         </w:rPr>
-        <w:t>6.11 Rekap Transaksi</w:t>
+        <w:t>8.11 Rekap Transaksi</w:t>
       </w:r>
     </w:p>
     <w:p>
@@ -5801,7 +6663,7 @@
           <w:b/>
           <w:sz w:val="20"/>
         </w:rPr>
-        <w:t>6.12 Rekonsiliasi</w:t>
+        <w:t>8.12 Rekonsiliasi</w:t>
       </w:r>
     </w:p>
     <w:p>
@@ -5836,7 +6698,7 @@
           <w:b/>
           <w:sz w:val="20"/>
         </w:rPr>
-        <w:t>6.13 Invoice</w:t>
+        <w:t>8.13 Invoice</w:t>
       </w:r>
     </w:p>
     <w:p>
@@ -5879,7 +6741,7 @@
           <w:color w:val="2E75B5"/>
           <w:sz w:val="24"/>
         </w:rPr>
-        <w:t>7. Validasi &amp; Negative Cases (Sesi Khusus)</w:t>
+        <w:t>9. Validasi &amp; Negative Cases (Sesi Khusus)</w:t>
       </w:r>
     </w:p>
     <w:tbl>
@@ -7545,7 +8407,1072 @@
           <w:color w:val="2E75B5"/>
           <w:sz w:val="24"/>
         </w:rPr>
-        <w:t>8. Data Test &amp; Cleanup</w:t>
+        <w:t>10. Glossary</w:t>
+      </w:r>
+    </w:p>
+    <w:tbl>
+      <w:tblPr>
+        <w:tblStyle w:val="LightGrid-Accent1"/>
+        <w:tblW w:type="auto" w:w="0"/>
+        <w:jc w:val="center"/>
+        <w:tblLayout w:type="autofit"/>
+        <w:tblLook w:firstColumn="1" w:firstRow="1" w:lastColumn="0" w:lastRow="0" w:noHBand="0" w:noVBand="1" w:val="04A0"/>
+      </w:tblPr>
+      <w:tblGrid>
+        <w:gridCol w:w="5256"/>
+        <w:gridCol w:w="5256"/>
+      </w:tblGrid>
+      <w:tr>
+        <w:tc>
+          <w:tcPr>
+            <w:tcW w:type="dxa" w:w="5256"/>
+            <w:shd w:fill="2E75B5" w:val="clear"/>
+            <w:vAlign w:val="center"/>
+          </w:tcPr>
+          <w:p>
+            <w:pPr>
+              <w:spacing w:after="40"/>
+              <w:jc w:val="center"/>
+            </w:pPr>
+            <w:r>
+              <w:rPr>
+                <w:b/>
+                <w:color w:val="FFFFFF"/>
+                <w:sz w:val="16"/>
+              </w:rPr>
+              <w:t>Istilah</w:t>
+            </w:r>
+          </w:p>
+        </w:tc>
+        <w:tc>
+          <w:tcPr>
+            <w:tcW w:type="dxa" w:w="5256"/>
+            <w:shd w:fill="2E75B5" w:val="clear"/>
+            <w:vAlign w:val="center"/>
+          </w:tcPr>
+          <w:p>
+            <w:pPr>
+              <w:spacing w:after="40"/>
+              <w:jc w:val="center"/>
+            </w:pPr>
+            <w:r>
+              <w:rPr>
+                <w:b/>
+                <w:color w:val="FFFFFF"/>
+                <w:sz w:val="16"/>
+              </w:rPr>
+              <w:t>Definisi</w:t>
+            </w:r>
+          </w:p>
+        </w:tc>
+      </w:tr>
+      <w:tr>
+        <w:tc>
+          <w:tcPr>
+            <w:tcW w:type="dxa" w:w="5256"/>
+            <w:vAlign w:val="center"/>
+          </w:tcPr>
+          <w:p>
+            <w:pPr>
+              <w:spacing w:after="40"/>
+              <w:jc w:val="center"/>
+            </w:pPr>
+            <w:r>
+              <w:rPr>
+                <w:sz w:val="14"/>
+              </w:rPr>
+              <w:t>Biller</w:t>
+            </w:r>
+          </w:p>
+        </w:tc>
+        <w:tc>
+          <w:tcPr>
+            <w:tcW w:type="dxa" w:w="5256"/>
+            <w:vAlign w:val="center"/>
+          </w:tcPr>
+          <w:p>
+            <w:pPr>
+              <w:spacing w:after="40"/>
+              <w:jc w:val="center"/>
+            </w:pPr>
+            <w:r>
+              <w:rPr>
+                <w:sz w:val="14"/>
+              </w:rPr>
+              <w:t>Penyedia tagihan (PLN, PDAM, Telkom) yang di-aggregasi</w:t>
+            </w:r>
+          </w:p>
+        </w:tc>
+      </w:tr>
+      <w:tr>
+        <w:tc>
+          <w:tcPr>
+            <w:tcW w:type="dxa" w:w="5256"/>
+            <w:vAlign w:val="center"/>
+          </w:tcPr>
+          <w:p>
+            <w:pPr>
+              <w:spacing w:after="40"/>
+              <w:jc w:val="center"/>
+            </w:pPr>
+            <w:r>
+              <w:rPr>
+                <w:sz w:val="14"/>
+              </w:rPr>
+              <w:t>Mitra</w:t>
+            </w:r>
+          </w:p>
+        </w:tc>
+        <w:tc>
+          <w:tcPr>
+            <w:tcW w:type="dxa" w:w="5256"/>
+            <w:vAlign w:val="center"/>
+          </w:tcPr>
+          <w:p>
+            <w:pPr>
+              <w:spacing w:after="40"/>
+              <w:jc w:val="center"/>
+            </w:pPr>
+            <w:r>
+              <w:rPr>
+                <w:sz w:val="14"/>
+              </w:rPr>
+              <w:t>Partner yang menjual produk biller ke end-user</w:t>
+            </w:r>
+          </w:p>
+        </w:tc>
+      </w:tr>
+      <w:tr>
+        <w:tc>
+          <w:tcPr>
+            <w:tcW w:type="dxa" w:w="5256"/>
+            <w:vAlign w:val="center"/>
+          </w:tcPr>
+          <w:p>
+            <w:pPr>
+              <w:spacing w:after="40"/>
+              <w:jc w:val="center"/>
+            </w:pPr>
+            <w:r>
+              <w:rPr>
+                <w:sz w:val="14"/>
+              </w:rPr>
+              <w:t>PSP</w:t>
+            </w:r>
+          </w:p>
+        </w:tc>
+        <w:tc>
+          <w:tcPr>
+            <w:tcW w:type="dxa" w:w="5256"/>
+            <w:vAlign w:val="center"/>
+          </w:tcPr>
+          <w:p>
+            <w:pPr>
+              <w:spacing w:after="40"/>
+              <w:jc w:val="center"/>
+            </w:pPr>
+            <w:r>
+              <w:rPr>
+                <w:sz w:val="14"/>
+              </w:rPr>
+              <w:t>Payment Service Provider — mitra pembayaran</w:t>
+            </w:r>
+          </w:p>
+        </w:tc>
+      </w:tr>
+      <w:tr>
+        <w:tc>
+          <w:tcPr>
+            <w:tcW w:type="dxa" w:w="5256"/>
+            <w:vAlign w:val="center"/>
+          </w:tcPr>
+          <w:p>
+            <w:pPr>
+              <w:spacing w:after="40"/>
+              <w:jc w:val="center"/>
+            </w:pPr>
+            <w:r>
+              <w:rPr>
+                <w:sz w:val="14"/>
+              </w:rPr>
+              <w:t>Rekonsiliasi</w:t>
+            </w:r>
+          </w:p>
+        </w:tc>
+        <w:tc>
+          <w:tcPr>
+            <w:tcW w:type="dxa" w:w="5256"/>
+            <w:vAlign w:val="center"/>
+          </w:tcPr>
+          <w:p>
+            <w:pPr>
+              <w:spacing w:after="40"/>
+              <w:jc w:val="center"/>
+            </w:pPr>
+            <w:r>
+              <w:rPr>
+                <w:sz w:val="14"/>
+              </w:rPr>
+              <w:t>Pencocokan transaksi BA vs Biller (Goto, Kudo, E2Pay, AyoConnect)</w:t>
+            </w:r>
+          </w:p>
+        </w:tc>
+      </w:tr>
+      <w:tr>
+        <w:tc>
+          <w:tcPr>
+            <w:tcW w:type="dxa" w:w="5256"/>
+            <w:vAlign w:val="center"/>
+          </w:tcPr>
+          <w:p>
+            <w:pPr>
+              <w:spacing w:after="40"/>
+              <w:jc w:val="center"/>
+            </w:pPr>
+            <w:r>
+              <w:rPr>
+                <w:sz w:val="14"/>
+              </w:rPr>
+              <w:t>Invoice</w:t>
+            </w:r>
+          </w:p>
+        </w:tc>
+        <w:tc>
+          <w:tcPr>
+            <w:tcW w:type="dxa" w:w="5256"/>
+            <w:vAlign w:val="center"/>
+          </w:tcPr>
+          <w:p>
+            <w:pPr>
+              <w:spacing w:after="40"/>
+              <w:jc w:val="center"/>
+            </w:pPr>
+            <w:r>
+              <w:rPr>
+                <w:sz w:val="14"/>
+              </w:rPr>
+              <w:t>Tagihan mitra per periode, status Belum Lunas → Lunas</w:t>
+            </w:r>
+          </w:p>
+        </w:tc>
+      </w:tr>
+      <w:tr>
+        <w:tc>
+          <w:tcPr>
+            <w:tcW w:type="dxa" w:w="5256"/>
+            <w:vAlign w:val="center"/>
+          </w:tcPr>
+          <w:p>
+            <w:pPr>
+              <w:spacing w:after="40"/>
+              <w:jc w:val="center"/>
+            </w:pPr>
+            <w:r>
+              <w:rPr>
+                <w:sz w:val="14"/>
+              </w:rPr>
+              <w:t>Top Up</w:t>
+            </w:r>
+          </w:p>
+        </w:tc>
+        <w:tc>
+          <w:tcPr>
+            <w:tcW w:type="dxa" w:w="5256"/>
+            <w:vAlign w:val="center"/>
+          </w:tcPr>
+          <w:p>
+            <w:pPr>
+              <w:spacing w:after="40"/>
+              <w:jc w:val="center"/>
+            </w:pPr>
+            <w:r>
+              <w:rPr>
+                <w:sz w:val="14"/>
+              </w:rPr>
+              <w:t>Penambahan saldo mitra `Rp 50.000`</w:t>
+            </w:r>
+          </w:p>
+        </w:tc>
+      </w:tr>
+      <w:tr>
+        <w:tc>
+          <w:tcPr>
+            <w:tcW w:type="dxa" w:w="5256"/>
+            <w:vAlign w:val="center"/>
+          </w:tcPr>
+          <w:p>
+            <w:pPr>
+              <w:spacing w:after="40"/>
+              <w:jc w:val="center"/>
+            </w:pPr>
+            <w:r>
+              <w:rPr>
+                <w:sz w:val="14"/>
+              </w:rPr>
+              <w:t>Product Pricing</w:t>
+            </w:r>
+          </w:p>
+        </w:tc>
+        <w:tc>
+          <w:tcPr>
+            <w:tcW w:type="dxa" w:w="5256"/>
+            <w:vAlign w:val="center"/>
+          </w:tcPr>
+          <w:p>
+            <w:pPr>
+              <w:spacing w:after="40"/>
+              <w:jc w:val="center"/>
+            </w:pPr>
+            <w:r>
+              <w:rPr>
+                <w:sz w:val="14"/>
+              </w:rPr>
+              <w:t>Harga produk per mitra, Generate</w:t>
+            </w:r>
+          </w:p>
+        </w:tc>
+      </w:tr>
+      <w:tr>
+        <w:tc>
+          <w:tcPr>
+            <w:tcW w:type="dxa" w:w="5256"/>
+            <w:vAlign w:val="center"/>
+          </w:tcPr>
+          <w:p>
+            <w:pPr>
+              <w:spacing w:after="40"/>
+              <w:jc w:val="center"/>
+            </w:pPr>
+            <w:r>
+              <w:rPr>
+                <w:sz w:val="14"/>
+              </w:rPr>
+              <w:t>OTP</w:t>
+            </w:r>
+          </w:p>
+        </w:tc>
+        <w:tc>
+          <w:tcPr>
+            <w:tcW w:type="dxa" w:w="5256"/>
+            <w:vAlign w:val="center"/>
+          </w:tcPr>
+          <w:p>
+            <w:pPr>
+              <w:spacing w:after="40"/>
+              <w:jc w:val="center"/>
+            </w:pPr>
+            <w:r>
+              <w:rPr>
+                <w:sz w:val="14"/>
+              </w:rPr>
+              <w:t>One-Time Password 6 digit `000000` dummy</w:t>
+            </w:r>
+          </w:p>
+        </w:tc>
+      </w:tr>
+      <w:tr>
+        <w:tc>
+          <w:tcPr>
+            <w:tcW w:type="dxa" w:w="5256"/>
+            <w:vAlign w:val="center"/>
+          </w:tcPr>
+          <w:p>
+            <w:pPr>
+              <w:spacing w:after="40"/>
+              <w:jc w:val="center"/>
+            </w:pPr>
+            <w:r>
+              <w:rPr>
+                <w:sz w:val="14"/>
+              </w:rPr>
+              <w:t>403</w:t>
+            </w:r>
+          </w:p>
+        </w:tc>
+        <w:tc>
+          <w:tcPr>
+            <w:tcW w:type="dxa" w:w="5256"/>
+            <w:vAlign w:val="center"/>
+          </w:tcPr>
+          <w:p>
+            <w:pPr>
+              <w:spacing w:after="40"/>
+              <w:jc w:val="center"/>
+            </w:pPr>
+            <w:r>
+              <w:rPr>
+                <w:sz w:val="14"/>
+              </w:rPr>
+              <w:t>Forbidden — tidak punya izin hapus Menu</w:t>
+            </w:r>
+          </w:p>
+        </w:tc>
+      </w:tr>
+      <w:tr>
+        <w:tc>
+          <w:tcPr>
+            <w:tcW w:type="dxa" w:w="5256"/>
+            <w:vAlign w:val="center"/>
+          </w:tcPr>
+          <w:p>
+            <w:pPr>
+              <w:spacing w:after="40"/>
+              <w:jc w:val="center"/>
+            </w:pPr>
+            <w:r>
+              <w:rPr>
+                <w:sz w:val="14"/>
+              </w:rPr>
+              <w:t>XLSX</w:t>
+            </w:r>
+          </w:p>
+        </w:tc>
+        <w:tc>
+          <w:tcPr>
+            <w:tcW w:type="dxa" w:w="5256"/>
+            <w:vAlign w:val="center"/>
+          </w:tcPr>
+          <w:p>
+            <w:pPr>
+              <w:spacing w:after="40"/>
+              <w:jc w:val="center"/>
+            </w:pPr>
+            <w:r>
+              <w:rPr>
+                <w:sz w:val="14"/>
+              </w:rPr>
+              <w:t>Excel export `export_data/`</w:t>
+            </w:r>
+          </w:p>
+        </w:tc>
+      </w:tr>
+    </w:tbl>
+    <w:p>
+      <w:pPr>
+        <w:spacing w:after="80"/>
+      </w:pPr>
+    </w:p>
+    <w:p>
+      <w:pPr>
+        <w:pBdr>
+          <w:bottom w:val="single" w:sz="6" w:space="1" w:color="A0A0A0"/>
+        </w:pBdr>
+      </w:pPr>
+    </w:p>
+    <w:p>
+      <w:pPr>
+        <w:pStyle w:val="Heading2"/>
+        <w:spacing w:after="120"/>
+      </w:pPr>
+      <w:r>
+        <w:rPr>
+          <w:b/>
+          <w:color w:val="2E75B5"/>
+          <w:sz w:val="24"/>
+        </w:rPr>
+        <w:t>11. Safety &amp; Warnings</w:t>
+      </w:r>
+    </w:p>
+    <w:tbl>
+      <w:tblPr>
+        <w:tblStyle w:val="LightGrid-Accent1"/>
+        <w:tblW w:type="auto" w:w="0"/>
+        <w:jc w:val="center"/>
+        <w:tblLayout w:type="autofit"/>
+        <w:tblLook w:firstColumn="1" w:firstRow="1" w:lastColumn="0" w:lastRow="0" w:noHBand="0" w:noVBand="1" w:val="04A0"/>
+      </w:tblPr>
+      <w:tblGrid>
+        <w:gridCol w:w="3504"/>
+        <w:gridCol w:w="3504"/>
+        <w:gridCol w:w="3504"/>
+      </w:tblGrid>
+      <w:tr>
+        <w:tc>
+          <w:tcPr>
+            <w:tcW w:type="dxa" w:w="3504"/>
+            <w:shd w:fill="2E75B5" w:val="clear"/>
+            <w:vAlign w:val="center"/>
+          </w:tcPr>
+          <w:p>
+            <w:pPr>
+              <w:spacing w:after="40"/>
+              <w:jc w:val="center"/>
+            </w:pPr>
+            <w:r>
+              <w:rPr>
+                <w:b/>
+                <w:color w:val="FFFFFF"/>
+                <w:sz w:val="16"/>
+              </w:rPr>
+              <w:t>Warning</w:t>
+            </w:r>
+          </w:p>
+        </w:tc>
+        <w:tc>
+          <w:tcPr>
+            <w:tcW w:type="dxa" w:w="3504"/>
+            <w:shd w:fill="2E75B5" w:val="clear"/>
+            <w:vAlign w:val="center"/>
+          </w:tcPr>
+          <w:p>
+            <w:pPr>
+              <w:spacing w:after="40"/>
+              <w:jc w:val="center"/>
+            </w:pPr>
+            <w:r>
+              <w:rPr>
+                <w:b/>
+                <w:color w:val="FFFFFF"/>
+                <w:sz w:val="16"/>
+              </w:rPr>
+              <w:t>Detail</w:t>
+            </w:r>
+          </w:p>
+        </w:tc>
+        <w:tc>
+          <w:tcPr>
+            <w:tcW w:type="dxa" w:w="3504"/>
+            <w:shd w:fill="2E75B5" w:val="clear"/>
+            <w:vAlign w:val="center"/>
+          </w:tcPr>
+          <w:p>
+            <w:pPr>
+              <w:spacing w:after="40"/>
+              <w:jc w:val="center"/>
+            </w:pPr>
+            <w:r>
+              <w:rPr>
+                <w:b/>
+                <w:color w:val="FFFFFF"/>
+                <w:sz w:val="16"/>
+              </w:rPr>
+              <w:t>Mitigasi</w:t>
+            </w:r>
+          </w:p>
+        </w:tc>
+      </w:tr>
+      <w:tr>
+        <w:tc>
+          <w:tcPr>
+            <w:tcW w:type="dxa" w:w="3504"/>
+            <w:vAlign w:val="center"/>
+          </w:tcPr>
+          <w:p>
+            <w:pPr>
+              <w:spacing w:after="40"/>
+              <w:jc w:val="center"/>
+            </w:pPr>
+            <w:r>
+              <w:rPr>
+                <w:sz w:val="14"/>
+              </w:rPr>
+              <w:t>Hapus Menu 403</w:t>
+            </w:r>
+          </w:p>
+        </w:tc>
+        <w:tc>
+          <w:tcPr>
+            <w:tcW w:type="dxa" w:w="3504"/>
+            <w:vAlign w:val="center"/>
+          </w:tcPr>
+          <w:p>
+            <w:pPr>
+              <w:spacing w:after="40"/>
+              <w:jc w:val="center"/>
+            </w:pPr>
+            <w:r>
+              <w:rPr>
+                <w:sz w:val="14"/>
+              </w:rPr>
+              <w:t>`DELETE /api/v1/master/menu/delete` selalu 403 `BA-003`</w:t>
+            </w:r>
+          </w:p>
+        </w:tc>
+        <w:tc>
+          <w:tcPr>
+            <w:tcW w:type="dxa" w:w="3504"/>
+            <w:vAlign w:val="center"/>
+          </w:tcPr>
+          <w:p>
+            <w:pPr>
+              <w:spacing w:after="40"/>
+              <w:jc w:val="center"/>
+            </w:pPr>
+            <w:r>
+              <w:rPr>
+                <w:sz w:val="14"/>
+              </w:rPr>
+              <w:t>Jangan hapus Menu di prod; hubungi dev</w:t>
+            </w:r>
+          </w:p>
+        </w:tc>
+      </w:tr>
+      <w:tr>
+        <w:tc>
+          <w:tcPr>
+            <w:tcW w:type="dxa" w:w="3504"/>
+            <w:vAlign w:val="center"/>
+          </w:tcPr>
+          <w:p>
+            <w:pPr>
+              <w:spacing w:after="40"/>
+              <w:jc w:val="center"/>
+            </w:pPr>
+            <w:r>
+              <w:rPr>
+                <w:sz w:val="14"/>
+              </w:rPr>
+              <w:t>Duplikat Kode</w:t>
+            </w:r>
+          </w:p>
+        </w:tc>
+        <w:tc>
+          <w:tcPr>
+            <w:tcW w:type="dxa" w:w="3504"/>
+            <w:vAlign w:val="center"/>
+          </w:tcPr>
+          <w:p>
+            <w:pPr>
+              <w:spacing w:after="40"/>
+              <w:jc w:val="center"/>
+            </w:pPr>
+            <w:r>
+              <w:rPr>
+                <w:sz w:val="14"/>
+              </w:rPr>
+              <w:t>`Kode sudah digunakan` toast</w:t>
+            </w:r>
+          </w:p>
+        </w:tc>
+        <w:tc>
+          <w:tcPr>
+            <w:tcW w:type="dxa" w:w="3504"/>
+            <w:vAlign w:val="center"/>
+          </w:tcPr>
+          <w:p>
+            <w:pPr>
+              <w:spacing w:after="40"/>
+              <w:jc w:val="center"/>
+            </w:pPr>
+            <w:r>
+              <w:rPr>
+                <w:sz w:val="14"/>
+              </w:rPr>
+              <w:t>Gunakan `QA*+uniq` `Date.now()`</w:t>
+            </w:r>
+          </w:p>
+        </w:tc>
+      </w:tr>
+      <w:tr>
+        <w:tc>
+          <w:tcPr>
+            <w:tcW w:type="dxa" w:w="3504"/>
+            <w:vAlign w:val="center"/>
+          </w:tcPr>
+          <w:p>
+            <w:pPr>
+              <w:spacing w:after="40"/>
+              <w:jc w:val="center"/>
+            </w:pPr>
+            <w:r>
+              <w:rPr>
+                <w:sz w:val="14"/>
+              </w:rPr>
+              <w:t>Rate Limit OTP</w:t>
+            </w:r>
+          </w:p>
+        </w:tc>
+        <w:tc>
+          <w:tcPr>
+            <w:tcW w:type="dxa" w:w="3504"/>
+            <w:vAlign w:val="center"/>
+          </w:tcPr>
+          <w:p>
+            <w:pPr>
+              <w:spacing w:after="40"/>
+              <w:jc w:val="center"/>
+            </w:pPr>
+            <w:r>
+              <w:rPr>
+                <w:sz w:val="14"/>
+              </w:rPr>
+              <w:t>OTP `000000` dibatasi, jangan &gt;3x salah</w:t>
+            </w:r>
+          </w:p>
+        </w:tc>
+        <w:tc>
+          <w:tcPr>
+            <w:tcW w:type="dxa" w:w="3504"/>
+            <w:vAlign w:val="center"/>
+          </w:tcPr>
+          <w:p>
+            <w:pPr>
+              <w:spacing w:after="40"/>
+              <w:jc w:val="center"/>
+            </w:pPr>
+            <w:r>
+              <w:rPr>
+                <w:sz w:val="14"/>
+              </w:rPr>
+              <w:t>Test OTP salah max 1x `prepaid.spec.ts:2`</w:t>
+            </w:r>
+          </w:p>
+        </w:tc>
+      </w:tr>
+      <w:tr>
+        <w:tc>
+          <w:tcPr>
+            <w:tcW w:type="dxa" w:w="3504"/>
+            <w:vAlign w:val="center"/>
+          </w:tcPr>
+          <w:p>
+            <w:pPr>
+              <w:spacing w:after="40"/>
+              <w:jc w:val="center"/>
+            </w:pPr>
+            <w:r>
+              <w:rPr>
+                <w:sz w:val="14"/>
+              </w:rPr>
+              <w:t>Data Sampah</w:t>
+            </w:r>
+          </w:p>
+        </w:tc>
+        <w:tc>
+          <w:tcPr>
+            <w:tcW w:type="dxa" w:w="3504"/>
+            <w:vAlign w:val="center"/>
+          </w:tcPr>
+          <w:p>
+            <w:pPr>
+              <w:spacing w:after="40"/>
+              <w:jc w:val="center"/>
+            </w:pPr>
+            <w:r>
+              <w:rPr>
+                <w:sz w:val="14"/>
+              </w:rPr>
+              <w:t>Semua `ADD` harus `delete`</w:t>
+            </w:r>
+          </w:p>
+        </w:tc>
+        <w:tc>
+          <w:tcPr>
+            <w:tcW w:type="dxa" w:w="3504"/>
+            <w:vAlign w:val="center"/>
+          </w:tcPr>
+          <w:p>
+            <w:pPr>
+              <w:spacing w:after="40"/>
+              <w:jc w:val="center"/>
+            </w:pPr>
+            <w:r>
+              <w:rPr>
+                <w:sz w:val="14"/>
+              </w:rPr>
+              <w:t>`hasRow ? delete → hasRow false`</w:t>
+            </w:r>
+          </w:p>
+        </w:tc>
+      </w:tr>
+    </w:tbl>
+    <w:p>
+      <w:pPr>
+        <w:spacing w:after="80"/>
+      </w:pPr>
+    </w:p>
+    <w:p>
+      <w:pPr>
+        <w:pBdr>
+          <w:bottom w:val="single" w:sz="6" w:space="1" w:color="A0A0A0"/>
+        </w:pBdr>
+      </w:pPr>
+    </w:p>
+    <w:p>
+      <w:pPr>
+        <w:pStyle w:val="Heading2"/>
+        <w:spacing w:after="120"/>
+      </w:pPr>
+      <w:r>
+        <w:rPr>
+          <w:b/>
+          <w:color w:val="2E75B5"/>
+          <w:sz w:val="24"/>
+        </w:rPr>
+        <w:t>12. FAQ</w:t>
+      </w:r>
+    </w:p>
+    <w:tbl>
+      <w:tblPr>
+        <w:tblStyle w:val="LightGrid-Accent1"/>
+        <w:tblW w:type="auto" w:w="0"/>
+        <w:jc w:val="center"/>
+        <w:tblLayout w:type="autofit"/>
+        <w:tblLook w:firstColumn="1" w:firstRow="1" w:lastColumn="0" w:lastRow="0" w:noHBand="0" w:noVBand="1" w:val="04A0"/>
+      </w:tblPr>
+      <w:tblGrid>
+        <w:gridCol w:w="5256"/>
+        <w:gridCol w:w="5256"/>
+      </w:tblGrid>
+      <w:tr>
+        <w:tc>
+          <w:tcPr>
+            <w:tcW w:type="dxa" w:w="5256"/>
+            <w:shd w:fill="2E75B5" w:val="clear"/>
+            <w:vAlign w:val="center"/>
+          </w:tcPr>
+          <w:p>
+            <w:pPr>
+              <w:spacing w:after="40"/>
+              <w:jc w:val="center"/>
+            </w:pPr>
+            <w:r>
+              <w:rPr>
+                <w:b/>
+                <w:color w:val="FFFFFF"/>
+                <w:sz w:val="16"/>
+              </w:rPr>
+              <w:t>Q</w:t>
+            </w:r>
+          </w:p>
+        </w:tc>
+        <w:tc>
+          <w:tcPr>
+            <w:tcW w:type="dxa" w:w="5256"/>
+            <w:shd w:fill="2E75B5" w:val="clear"/>
+            <w:vAlign w:val="center"/>
+          </w:tcPr>
+          <w:p>
+            <w:pPr>
+              <w:spacing w:after="40"/>
+              <w:jc w:val="center"/>
+            </w:pPr>
+            <w:r>
+              <w:rPr>
+                <w:b/>
+                <w:color w:val="FFFFFF"/>
+                <w:sz w:val="16"/>
+              </w:rPr>
+              <w:t>A</w:t>
+            </w:r>
+          </w:p>
+        </w:tc>
+      </w:tr>
+      <w:tr>
+        <w:tc>
+          <w:tcPr>
+            <w:tcW w:type="dxa" w:w="5256"/>
+            <w:vAlign w:val="center"/>
+          </w:tcPr>
+          <w:p>
+            <w:pPr>
+              <w:spacing w:after="40"/>
+              <w:jc w:val="center"/>
+            </w:pPr>
+            <w:r>
+              <w:rPr>
+                <w:sz w:val="14"/>
+              </w:rPr>
+              <w:t>Login gagal `Email atau password salah`?</w:t>
+            </w:r>
+          </w:p>
+        </w:tc>
+        <w:tc>
+          <w:tcPr>
+            <w:tcW w:type="dxa" w:w="5256"/>
+            <w:vAlign w:val="center"/>
+          </w:tcPr>
+          <w:p>
+            <w:pPr>
+              <w:spacing w:after="40"/>
+              <w:jc w:val="center"/>
+            </w:pPr>
+            <w:r>
+              <w:rPr>
+                <w:sz w:val="14"/>
+              </w:rPr>
+              <w:t>Cek `subandonorogo@gmail.com` `shared/test-data/users.json` dan `TEST_ENV`</w:t>
+            </w:r>
+          </w:p>
+        </w:tc>
+      </w:tr>
+      <w:tr>
+        <w:tc>
+          <w:tcPr>
+            <w:tcW w:type="dxa" w:w="5256"/>
+            <w:vAlign w:val="center"/>
+          </w:tcPr>
+          <w:p>
+            <w:pPr>
+              <w:spacing w:after="40"/>
+              <w:jc w:val="center"/>
+            </w:pPr>
+            <w:r>
+              <w:rPr>
+                <w:sz w:val="14"/>
+              </w:rPr>
+              <w:t>Captcha tidak hilang?</w:t>
+            </w:r>
+          </w:p>
+        </w:tc>
+        <w:tc>
+          <w:tcPr>
+            <w:tcW w:type="dxa" w:w="5256"/>
+            <w:vAlign w:val="center"/>
+          </w:tcPr>
+          <w:p>
+            <w:pPr>
+              <w:spacing w:after="40"/>
+              <w:jc w:val="center"/>
+            </w:pPr>
+            <w:r>
+              <w:rPr>
+                <w:sz w:val="14"/>
+              </w:rPr>
+              <w:t>Tunggu `skeleton` hidden `setup/auth.webview-nona.setup.ts:32` + `force click span`</w:t>
+            </w:r>
+          </w:p>
+        </w:tc>
+      </w:tr>
+      <w:tr>
+        <w:tc>
+          <w:tcPr>
+            <w:tcW w:type="dxa" w:w="5256"/>
+            <w:vAlign w:val="center"/>
+          </w:tcPr>
+          <w:p>
+            <w:pPr>
+              <w:spacing w:after="40"/>
+              <w:jc w:val="center"/>
+            </w:pPr>
+            <w:r>
+              <w:rPr>
+                <w:sz w:val="14"/>
+              </w:rPr>
+              <w:t>Search Bank selalu Tidak ada data?</w:t>
+            </w:r>
+          </w:p>
+        </w:tc>
+        <w:tc>
+          <w:tcPr>
+            <w:tcW w:type="dxa" w:w="5256"/>
+            <w:vAlign w:val="center"/>
+          </w:tcPr>
+          <w:p>
+            <w:pPr>
+              <w:spacing w:after="40"/>
+              <w:jc w:val="center"/>
+            </w:pPr>
+            <w:r>
+              <w:rPr>
+                <w:sz w:val="14"/>
+              </w:rPr>
+              <w:t>`BA-001` known bug, pakai scan tabel tanpa filter</w:t>
+            </w:r>
+          </w:p>
+        </w:tc>
+      </w:tr>
+      <w:tr>
+        <w:tc>
+          <w:tcPr>
+            <w:tcW w:type="dxa" w:w="5256"/>
+            <w:vAlign w:val="center"/>
+          </w:tcPr>
+          <w:p>
+            <w:pPr>
+              <w:spacing w:after="40"/>
+              <w:jc w:val="center"/>
+            </w:pPr>
+            <w:r>
+              <w:rPr>
+                <w:sz w:val="14"/>
+              </w:rPr>
+              <w:t>Export XLSX dimana?</w:t>
+            </w:r>
+          </w:p>
+        </w:tc>
+        <w:tc>
+          <w:tcPr>
+            <w:tcW w:type="dxa" w:w="5256"/>
+            <w:vAlign w:val="center"/>
+          </w:tcPr>
+          <w:p>
+            <w:pPr>
+              <w:spacing w:after="40"/>
+              <w:jc w:val="center"/>
+            </w:pPr>
+            <w:r>
+              <w:rPr>
+                <w:sz w:val="14"/>
+              </w:rPr>
+              <w:t>`backoffice-tests/bots/ba/export_data/` `BaTransaksiPage`</w:t>
+            </w:r>
+          </w:p>
+        </w:tc>
+      </w:tr>
+      <w:tr>
+        <w:tc>
+          <w:tcPr>
+            <w:tcW w:type="dxa" w:w="5256"/>
+            <w:vAlign w:val="center"/>
+          </w:tcPr>
+          <w:p>
+            <w:pPr>
+              <w:spacing w:after="40"/>
+              <w:jc w:val="center"/>
+            </w:pPr>
+            <w:r>
+              <w:rPr>
+                <w:sz w:val="14"/>
+              </w:rPr>
+              <w:t>PDF report dimana?</w:t>
+            </w:r>
+          </w:p>
+        </w:tc>
+        <w:tc>
+          <w:tcPr>
+            <w:tcW w:type="dxa" w:w="5256"/>
+            <w:vAlign w:val="center"/>
+          </w:tcPr>
+          <w:p>
+            <w:pPr>
+              <w:spacing w:after="40"/>
+              <w:jc w:val="center"/>
+            </w:pPr>
+            <w:r>
+              <w:rPr>
+                <w:sz w:val="14"/>
+              </w:rPr>
+              <w:t>`test-results/pdf/report-*.pdf` `scripts/generate-pdf-report.ts`</w:t>
+            </w:r>
+          </w:p>
+        </w:tc>
+      </w:tr>
+    </w:tbl>
+    <w:p>
+      <w:pPr>
+        <w:spacing w:after="80"/>
+      </w:pPr>
+    </w:p>
+    <w:p>
+      <w:pPr>
+        <w:pBdr>
+          <w:bottom w:val="single" w:sz="6" w:space="1" w:color="A0A0A0"/>
+        </w:pBdr>
+      </w:pPr>
+    </w:p>
+    <w:p>
+      <w:pPr>
+        <w:pStyle w:val="Heading2"/>
+        <w:spacing w:after="120"/>
+      </w:pPr>
+      <w:r>
+        <w:rPr>
+          <w:b/>
+          <w:color w:val="2E75B5"/>
+          <w:sz w:val="24"/>
+        </w:rPr>
+        <w:t>13. Data Test &amp; Cleanup</w:t>
       </w:r>
     </w:p>
     <w:p>
@@ -7610,7 +9537,7 @@
           <w:color w:val="2E75B5"/>
           <w:sz w:val="24"/>
         </w:rPr>
-        <w:t>9. Troubleshooting</w:t>
+        <w:t>14. Troubleshooting</w:t>
       </w:r>
     </w:p>
     <w:tbl>
@@ -7995,7 +9922,7 @@
           <w:color w:val="2E75B5"/>
           <w:sz w:val="24"/>
         </w:rPr>
-        <w:t>10. Catatan Temuan</w:t>
+        <w:t>15. Catatan Temuan</w:t>
       </w:r>
     </w:p>
     <w:p>
@@ -8603,7 +10530,285 @@
           <w:color w:val="2E75B5"/>
           <w:sz w:val="24"/>
         </w:rPr>
-        <w:t>11. Lampiran</w:t>
+        <w:t>16. Lampiran &amp; Index</w:t>
+      </w:r>
+    </w:p>
+    <w:p>
+      <w:pPr>
+        <w:pStyle w:val="Heading3"/>
+        <w:spacing w:after="120"/>
+      </w:pPr>
+      <w:r>
+        <w:rPr>
+          <w:b/>
+          <w:sz w:val="20"/>
+        </w:rPr>
+        <w:t>16.1 Index</w:t>
+      </w:r>
+    </w:p>
+    <w:tbl>
+      <w:tblPr>
+        <w:tblStyle w:val="LightGrid-Accent1"/>
+        <w:tblW w:type="auto" w:w="0"/>
+        <w:jc w:val="center"/>
+        <w:tblLayout w:type="autofit"/>
+        <w:tblLook w:firstColumn="1" w:firstRow="1" w:lastColumn="0" w:lastRow="0" w:noHBand="0" w:noVBand="1" w:val="04A0"/>
+      </w:tblPr>
+      <w:tblGrid>
+        <w:gridCol w:w="5256"/>
+        <w:gridCol w:w="5256"/>
+      </w:tblGrid>
+      <w:tr>
+        <w:tc>
+          <w:tcPr>
+            <w:tcW w:type="dxa" w:w="5256"/>
+            <w:shd w:fill="2E75B5" w:val="clear"/>
+            <w:vAlign w:val="center"/>
+          </w:tcPr>
+          <w:p>
+            <w:pPr>
+              <w:spacing w:after="40"/>
+              <w:jc w:val="center"/>
+            </w:pPr>
+            <w:r>
+              <w:rPr>
+                <w:b/>
+                <w:color w:val="FFFFFF"/>
+                <w:sz w:val="16"/>
+              </w:rPr>
+              <w:t>Keyword</w:t>
+            </w:r>
+          </w:p>
+        </w:tc>
+        <w:tc>
+          <w:tcPr>
+            <w:tcW w:type="dxa" w:w="5256"/>
+            <w:shd w:fill="2E75B5" w:val="clear"/>
+            <w:vAlign w:val="center"/>
+          </w:tcPr>
+          <w:p>
+            <w:pPr>
+              <w:spacing w:after="40"/>
+              <w:jc w:val="center"/>
+            </w:pPr>
+            <w:r>
+              <w:rPr>
+                <w:b/>
+                <w:color w:val="FFFFFF"/>
+                <w:sz w:val="16"/>
+              </w:rPr>
+              <w:t>Halaman</w:t>
+            </w:r>
+          </w:p>
+        </w:tc>
+      </w:tr>
+      <w:tr>
+        <w:tc>
+          <w:tcPr>
+            <w:tcW w:type="dxa" w:w="5256"/>
+            <w:vAlign w:val="center"/>
+          </w:tcPr>
+          <w:p>
+            <w:pPr>
+              <w:spacing w:after="40"/>
+              <w:jc w:val="center"/>
+            </w:pPr>
+            <w:r>
+              <w:rPr>
+                <w:sz w:val="14"/>
+              </w:rPr>
+              <w:t>Bank</w:t>
+            </w:r>
+          </w:p>
+        </w:tc>
+        <w:tc>
+          <w:tcPr>
+            <w:tcW w:type="dxa" w:w="5256"/>
+            <w:vAlign w:val="center"/>
+          </w:tcPr>
+          <w:p>
+            <w:pPr>
+              <w:spacing w:after="40"/>
+              <w:jc w:val="center"/>
+            </w:pPr>
+            <w:r>
+              <w:rPr>
+                <w:sz w:val="14"/>
+              </w:rPr>
+              <w:t>8.2</w:t>
+            </w:r>
+          </w:p>
+        </w:tc>
+      </w:tr>
+      <w:tr>
+        <w:tc>
+          <w:tcPr>
+            <w:tcW w:type="dxa" w:w="5256"/>
+            <w:vAlign w:val="center"/>
+          </w:tcPr>
+          <w:p>
+            <w:pPr>
+              <w:spacing w:after="40"/>
+              <w:jc w:val="center"/>
+            </w:pPr>
+            <w:r>
+              <w:rPr>
+                <w:sz w:val="14"/>
+              </w:rPr>
+              <w:t>Invoice</w:t>
+            </w:r>
+          </w:p>
+        </w:tc>
+        <w:tc>
+          <w:tcPr>
+            <w:tcW w:type="dxa" w:w="5256"/>
+            <w:vAlign w:val="center"/>
+          </w:tcPr>
+          <w:p>
+            <w:pPr>
+              <w:spacing w:after="40"/>
+              <w:jc w:val="center"/>
+            </w:pPr>
+            <w:r>
+              <w:rPr>
+                <w:sz w:val="14"/>
+              </w:rPr>
+              <w:t>8.13</w:t>
+            </w:r>
+          </w:p>
+        </w:tc>
+      </w:tr>
+      <w:tr>
+        <w:tc>
+          <w:tcPr>
+            <w:tcW w:type="dxa" w:w="5256"/>
+            <w:vAlign w:val="center"/>
+          </w:tcPr>
+          <w:p>
+            <w:pPr>
+              <w:spacing w:after="40"/>
+              <w:jc w:val="center"/>
+            </w:pPr>
+            <w:r>
+              <w:rPr>
+                <w:sz w:val="14"/>
+              </w:rPr>
+              <w:t>Login</w:t>
+            </w:r>
+          </w:p>
+        </w:tc>
+        <w:tc>
+          <w:tcPr>
+            <w:tcW w:type="dxa" w:w="5256"/>
+            <w:vAlign w:val="center"/>
+          </w:tcPr>
+          <w:p>
+            <w:pPr>
+              <w:spacing w:after="40"/>
+              <w:jc w:val="center"/>
+            </w:pPr>
+            <w:r>
+              <w:rPr>
+                <w:sz w:val="14"/>
+              </w:rPr>
+              <w:t>4</w:t>
+            </w:r>
+          </w:p>
+        </w:tc>
+      </w:tr>
+      <w:tr>
+        <w:tc>
+          <w:tcPr>
+            <w:tcW w:type="dxa" w:w="5256"/>
+            <w:vAlign w:val="center"/>
+          </w:tcPr>
+          <w:p>
+            <w:pPr>
+              <w:spacing w:after="40"/>
+              <w:jc w:val="center"/>
+            </w:pPr>
+            <w:r>
+              <w:rPr>
+                <w:sz w:val="14"/>
+              </w:rPr>
+              <w:t>Mitra Top Up</w:t>
+            </w:r>
+          </w:p>
+        </w:tc>
+        <w:tc>
+          <w:tcPr>
+            <w:tcW w:type="dxa" w:w="5256"/>
+            <w:vAlign w:val="center"/>
+          </w:tcPr>
+          <w:p>
+            <w:pPr>
+              <w:spacing w:after="40"/>
+              <w:jc w:val="center"/>
+            </w:pPr>
+            <w:r>
+              <w:rPr>
+                <w:sz w:val="14"/>
+              </w:rPr>
+              <w:t>8.7</w:t>
+            </w:r>
+          </w:p>
+        </w:tc>
+      </w:tr>
+      <w:tr>
+        <w:tc>
+          <w:tcPr>
+            <w:tcW w:type="dxa" w:w="5256"/>
+            <w:vAlign w:val="center"/>
+          </w:tcPr>
+          <w:p>
+            <w:pPr>
+              <w:spacing w:after="40"/>
+              <w:jc w:val="center"/>
+            </w:pPr>
+            <w:r>
+              <w:rPr>
+                <w:sz w:val="14"/>
+              </w:rPr>
+              <w:t>Role</w:t>
+            </w:r>
+          </w:p>
+        </w:tc>
+        <w:tc>
+          <w:tcPr>
+            <w:tcW w:type="dxa" w:w="5256"/>
+            <w:vAlign w:val="center"/>
+          </w:tcPr>
+          <w:p>
+            <w:pPr>
+              <w:spacing w:after="40"/>
+              <w:jc w:val="center"/>
+            </w:pPr>
+            <w:r>
+              <w:rPr>
+                <w:sz w:val="14"/>
+              </w:rPr>
+              <w:t>8.9</w:t>
+            </w:r>
+          </w:p>
+        </w:tc>
+      </w:tr>
+    </w:tbl>
+    <w:p>
+      <w:pPr>
+        <w:spacing w:after="80"/>
+      </w:pPr>
+    </w:p>
+    <w:p>
+      <w:pPr>
+        <w:pStyle w:val="Heading3"/>
+        <w:spacing w:after="120"/>
+      </w:pPr>
+      <w:r>
+        <w:rPr>
+          <w:b/>
+          <w:sz w:val="20"/>
+        </w:rPr>
+        <w:t>16.2 Lampiran</w:t>
       </w:r>
     </w:p>
     <w:p>
@@ -8668,7 +10873,7 @@
           <w:color w:val="2E75B5"/>
           <w:sz w:val="24"/>
         </w:rPr>
-        <w:t>12. Kontak</w:t>
+        <w:t>17. Kontak</w:t>
       </w:r>
     </w:p>
     <w:p>

</xml_diff>

<commit_message>
docs: biller-agg v1.2 + screenshots 13 (00-portal-login + 01-dashboard..12-invoice) 1.3M docx rapih
</commit_message>
<xml_diff>
--- a/docs/user-guide/biller-agg.docx
+++ b/docs/user-guide/biller-agg.docx
@@ -2032,6 +2032,59 @@
     </w:p>
     <w:p>
       <w:pPr>
+        <w:jc w:val="center"/>
+      </w:pPr>
+      <w:r>
+        <w:drawing>
+          <wp:inline xmlns:a="http://schemas.openxmlformats.org/drawingml/2006/main" xmlns:pic="http://schemas.openxmlformats.org/drawingml/2006/picture">
+            <wp:extent cx="5486400" cy="3086100"/>
+            <wp:docPr id="1" name="Picture 1"/>
+            <wp:cNvGraphicFramePr>
+              <a:graphicFrameLocks noChangeAspect="1"/>
+            </wp:cNvGraphicFramePr>
+            <a:graphic>
+              <a:graphicData uri="http://schemas.openxmlformats.org/drawingml/2006/picture">
+                <pic:pic>
+                  <pic:nvPicPr>
+                    <pic:cNvPr id="0" name="00-portal-login.png"/>
+                    <pic:cNvPicPr/>
+                  </pic:nvPicPr>
+                  <pic:blipFill>
+                    <a:blip r:embed="rId9"/>
+                    <a:stretch>
+                      <a:fillRect/>
+                    </a:stretch>
+                  </pic:blipFill>
+                  <pic:spPr>
+                    <a:xfrm>
+                      <a:off x="0" y="0"/>
+                      <a:ext cx="5486400" cy="3086100"/>
+                    </a:xfrm>
+                    <a:prstGeom prst="rect"/>
+                  </pic:spPr>
+                </pic:pic>
+              </a:graphicData>
+            </a:graphic>
+          </wp:inline>
+        </w:drawing>
+      </w:r>
+    </w:p>
+    <w:p>
+      <w:pPr>
+        <w:spacing w:after="120"/>
+        <w:jc w:val="center"/>
+      </w:pPr>
+      <w:r>
+        <w:rPr>
+          <w:i/>
+          <w:color w:val="666666"/>
+          <w:sz w:val="14"/>
+        </w:rPr>
+        <w:t>Gambar: Portal Login — assets/ba/00-portal-login.png</w:t>
+      </w:r>
+    </w:p>
+    <w:p>
+      <w:pPr>
         <w:pBdr>
           <w:bottom w:val="single" w:sz="6" w:space="1" w:color="A0A0A0"/>
         </w:pBdr>
@@ -5039,6 +5092,59 @@
     </w:p>
     <w:p>
       <w:pPr>
+        <w:jc w:val="center"/>
+      </w:pPr>
+      <w:r>
+        <w:drawing>
+          <wp:inline xmlns:a="http://schemas.openxmlformats.org/drawingml/2006/main" xmlns:pic="http://schemas.openxmlformats.org/drawingml/2006/picture">
+            <wp:extent cx="5486400" cy="5649278"/>
+            <wp:docPr id="2" name="Picture 2"/>
+            <wp:cNvGraphicFramePr>
+              <a:graphicFrameLocks noChangeAspect="1"/>
+            </wp:cNvGraphicFramePr>
+            <a:graphic>
+              <a:graphicData uri="http://schemas.openxmlformats.org/drawingml/2006/picture">
+                <pic:pic>
+                  <pic:nvPicPr>
+                    <pic:cNvPr id="0" name="01-dashboard.png"/>
+                    <pic:cNvPicPr/>
+                  </pic:nvPicPr>
+                  <pic:blipFill>
+                    <a:blip r:embed="rId10"/>
+                    <a:stretch>
+                      <a:fillRect/>
+                    </a:stretch>
+                  </pic:blipFill>
+                  <pic:spPr>
+                    <a:xfrm>
+                      <a:off x="0" y="0"/>
+                      <a:ext cx="5486400" cy="5649278"/>
+                    </a:xfrm>
+                    <a:prstGeom prst="rect"/>
+                  </pic:spPr>
+                </pic:pic>
+              </a:graphicData>
+            </a:graphic>
+          </wp:inline>
+        </w:drawing>
+      </w:r>
+    </w:p>
+    <w:p>
+      <w:pPr>
+        <w:spacing w:after="120"/>
+        <w:jc w:val="center"/>
+      </w:pPr>
+      <w:r>
+        <w:rPr>
+          <w:i/>
+          <w:color w:val="666666"/>
+          <w:sz w:val="14"/>
+        </w:rPr>
+        <w:t>Gambar: Dashboard — assets/ba/01-dashboard.png</w:t>
+      </w:r>
+    </w:p>
+    <w:p>
+      <w:pPr>
         <w:pStyle w:val="ListBullet"/>
       </w:pPr>
       <w:r>
@@ -5364,6 +5470,59 @@
           <w:sz w:val="20"/>
         </w:rPr>
         <w:t>8.2 Bank</w:t>
+      </w:r>
+    </w:p>
+    <w:p>
+      <w:pPr>
+        <w:jc w:val="center"/>
+      </w:pPr>
+      <w:r>
+        <w:drawing>
+          <wp:inline xmlns:a="http://schemas.openxmlformats.org/drawingml/2006/main" xmlns:pic="http://schemas.openxmlformats.org/drawingml/2006/picture">
+            <wp:extent cx="5486400" cy="4371975"/>
+            <wp:docPr id="3" name="Picture 3"/>
+            <wp:cNvGraphicFramePr>
+              <a:graphicFrameLocks noChangeAspect="1"/>
+            </wp:cNvGraphicFramePr>
+            <a:graphic>
+              <a:graphicData uri="http://schemas.openxmlformats.org/drawingml/2006/picture">
+                <pic:pic>
+                  <pic:nvPicPr>
+                    <pic:cNvPr id="0" name="02-bank.png"/>
+                    <pic:cNvPicPr/>
+                  </pic:nvPicPr>
+                  <pic:blipFill>
+                    <a:blip r:embed="rId11"/>
+                    <a:stretch>
+                      <a:fillRect/>
+                    </a:stretch>
+                  </pic:blipFill>
+                  <pic:spPr>
+                    <a:xfrm>
+                      <a:off x="0" y="0"/>
+                      <a:ext cx="5486400" cy="4371975"/>
+                    </a:xfrm>
+                    <a:prstGeom prst="rect"/>
+                  </pic:spPr>
+                </pic:pic>
+              </a:graphicData>
+            </a:graphic>
+          </wp:inline>
+        </w:drawing>
+      </w:r>
+    </w:p>
+    <w:p>
+      <w:pPr>
+        <w:spacing w:after="120"/>
+        <w:jc w:val="center"/>
+      </w:pPr>
+      <w:r>
+        <w:rPr>
+          <w:i/>
+          <w:color w:val="666666"/>
+          <w:sz w:val="14"/>
+        </w:rPr>
+        <w:t>Gambar: Bank — assets/ba/02-bank.png</w:t>
       </w:r>
     </w:p>
     <w:p>
@@ -5835,6 +5994,59 @@
     </w:p>
     <w:p>
       <w:pPr>
+        <w:jc w:val="center"/>
+      </w:pPr>
+      <w:r>
+        <w:drawing>
+          <wp:inline xmlns:a="http://schemas.openxmlformats.org/drawingml/2006/main" xmlns:pic="http://schemas.openxmlformats.org/drawingml/2006/picture">
+            <wp:extent cx="5486400" cy="3596164"/>
+            <wp:docPr id="4" name="Picture 4"/>
+            <wp:cNvGraphicFramePr>
+              <a:graphicFrameLocks noChangeAspect="1"/>
+            </wp:cNvGraphicFramePr>
+            <a:graphic>
+              <a:graphicData uri="http://schemas.openxmlformats.org/drawingml/2006/picture">
+                <pic:pic>
+                  <pic:nvPicPr>
+                    <pic:cNvPr id="0" name="03-billing-provider.png"/>
+                    <pic:cNvPicPr/>
+                  </pic:nvPicPr>
+                  <pic:blipFill>
+                    <a:blip r:embed="rId12"/>
+                    <a:stretch>
+                      <a:fillRect/>
+                    </a:stretch>
+                  </pic:blipFill>
+                  <pic:spPr>
+                    <a:xfrm>
+                      <a:off x="0" y="0"/>
+                      <a:ext cx="5486400" cy="3596164"/>
+                    </a:xfrm>
+                    <a:prstGeom prst="rect"/>
+                  </pic:spPr>
+                </pic:pic>
+              </a:graphicData>
+            </a:graphic>
+          </wp:inline>
+        </w:drawing>
+      </w:r>
+    </w:p>
+    <w:p>
+      <w:pPr>
+        <w:spacing w:after="120"/>
+        <w:jc w:val="center"/>
+      </w:pPr>
+      <w:r>
+        <w:rPr>
+          <w:i/>
+          <w:color w:val="666666"/>
+          <w:sz w:val="14"/>
+        </w:rPr>
+        <w:t>Gambar: Billing Provider — assets/ba/03-billing-provider.png</w:t>
+      </w:r>
+    </w:p>
+    <w:p>
+      <w:pPr>
         <w:pStyle w:val="ListBullet"/>
       </w:pPr>
       <w:r>
@@ -5892,6 +6104,59 @@
     </w:p>
     <w:p>
       <w:pPr>
+        <w:jc w:val="center"/>
+      </w:pPr>
+      <w:r>
+        <w:drawing>
+          <wp:inline xmlns:a="http://schemas.openxmlformats.org/drawingml/2006/main" xmlns:pic="http://schemas.openxmlformats.org/drawingml/2006/picture">
+            <wp:extent cx="5486400" cy="4757738"/>
+            <wp:docPr id="5" name="Picture 5"/>
+            <wp:cNvGraphicFramePr>
+              <a:graphicFrameLocks noChangeAspect="1"/>
+            </wp:cNvGraphicFramePr>
+            <a:graphic>
+              <a:graphicData uri="http://schemas.openxmlformats.org/drawingml/2006/picture">
+                <pic:pic>
+                  <pic:nvPicPr>
+                    <pic:cNvPr id="0" name="04-category-group.png"/>
+                    <pic:cNvPicPr/>
+                  </pic:nvPicPr>
+                  <pic:blipFill>
+                    <a:blip r:embed="rId13"/>
+                    <a:stretch>
+                      <a:fillRect/>
+                    </a:stretch>
+                  </pic:blipFill>
+                  <pic:spPr>
+                    <a:xfrm>
+                      <a:off x="0" y="0"/>
+                      <a:ext cx="5486400" cy="4757738"/>
+                    </a:xfrm>
+                    <a:prstGeom prst="rect"/>
+                  </pic:spPr>
+                </pic:pic>
+              </a:graphicData>
+            </a:graphic>
+          </wp:inline>
+        </w:drawing>
+      </w:r>
+    </w:p>
+    <w:p>
+      <w:pPr>
+        <w:spacing w:after="120"/>
+        <w:jc w:val="center"/>
+      </w:pPr>
+      <w:r>
+        <w:rPr>
+          <w:i/>
+          <w:color w:val="666666"/>
+          <w:sz w:val="14"/>
+        </w:rPr>
+        <w:t>Gambar: Kategori &amp; Grup — assets/ba/04-category-group.png</w:t>
+      </w:r>
+    </w:p>
+    <w:p>
+      <w:pPr>
         <w:pStyle w:val="ListBullet"/>
       </w:pPr>
       <w:r>
@@ -5934,6 +6199,59 @@
           <w:sz w:val="20"/>
         </w:rPr>
         <w:t>8.5 Menu</w:t>
+      </w:r>
+    </w:p>
+    <w:p>
+      <w:pPr>
+        <w:jc w:val="center"/>
+      </w:pPr>
+      <w:r>
+        <w:drawing>
+          <wp:inline xmlns:a="http://schemas.openxmlformats.org/drawingml/2006/main" xmlns:pic="http://schemas.openxmlformats.org/drawingml/2006/picture">
+            <wp:extent cx="5486400" cy="4457700"/>
+            <wp:docPr id="6" name="Picture 6"/>
+            <wp:cNvGraphicFramePr>
+              <a:graphicFrameLocks noChangeAspect="1"/>
+            </wp:cNvGraphicFramePr>
+            <a:graphic>
+              <a:graphicData uri="http://schemas.openxmlformats.org/drawingml/2006/picture">
+                <pic:pic>
+                  <pic:nvPicPr>
+                    <pic:cNvPr id="0" name="05-menu.png"/>
+                    <pic:cNvPicPr/>
+                  </pic:nvPicPr>
+                  <pic:blipFill>
+                    <a:blip r:embed="rId14"/>
+                    <a:stretch>
+                      <a:fillRect/>
+                    </a:stretch>
+                  </pic:blipFill>
+                  <pic:spPr>
+                    <a:xfrm>
+                      <a:off x="0" y="0"/>
+                      <a:ext cx="5486400" cy="4457700"/>
+                    </a:xfrm>
+                    <a:prstGeom prst="rect"/>
+                  </pic:spPr>
+                </pic:pic>
+              </a:graphicData>
+            </a:graphic>
+          </wp:inline>
+        </w:drawing>
+      </w:r>
+    </w:p>
+    <w:p>
+      <w:pPr>
+        <w:spacing w:after="120"/>
+        <w:jc w:val="center"/>
+      </w:pPr>
+      <w:r>
+        <w:rPr>
+          <w:i/>
+          <w:color w:val="666666"/>
+          <w:sz w:val="14"/>
+        </w:rPr>
+        <w:t>Gambar: Menu — assets/ba/05-menu.png</w:t>
       </w:r>
     </w:p>
     <w:p>
@@ -6377,6 +6695,59 @@
           <w:sz w:val="20"/>
         </w:rPr>
         <w:t>8.6 Mitra</w:t>
+      </w:r>
+    </w:p>
+    <w:p>
+      <w:pPr>
+        <w:jc w:val="center"/>
+      </w:pPr>
+      <w:r>
+        <w:drawing>
+          <wp:inline xmlns:a="http://schemas.openxmlformats.org/drawingml/2006/main" xmlns:pic="http://schemas.openxmlformats.org/drawingml/2006/picture">
+            <wp:extent cx="5486400" cy="3086100"/>
+            <wp:docPr id="7" name="Picture 7"/>
+            <wp:cNvGraphicFramePr>
+              <a:graphicFrameLocks noChangeAspect="1"/>
+            </wp:cNvGraphicFramePr>
+            <a:graphic>
+              <a:graphicData uri="http://schemas.openxmlformats.org/drawingml/2006/picture">
+                <pic:pic>
+                  <pic:nvPicPr>
+                    <pic:cNvPr id="0" name="06-mitra.png"/>
+                    <pic:cNvPicPr/>
+                  </pic:nvPicPr>
+                  <pic:blipFill>
+                    <a:blip r:embed="rId15"/>
+                    <a:stretch>
+                      <a:fillRect/>
+                    </a:stretch>
+                  </pic:blipFill>
+                  <pic:spPr>
+                    <a:xfrm>
+                      <a:off x="0" y="0"/>
+                      <a:ext cx="5486400" cy="3086100"/>
+                    </a:xfrm>
+                    <a:prstGeom prst="rect"/>
+                  </pic:spPr>
+                </pic:pic>
+              </a:graphicData>
+            </a:graphic>
+          </wp:inline>
+        </w:drawing>
+      </w:r>
+    </w:p>
+    <w:p>
+      <w:pPr>
+        <w:spacing w:after="120"/>
+        <w:jc w:val="center"/>
+      </w:pPr>
+      <w:r>
+        <w:rPr>
+          <w:i/>
+          <w:color w:val="666666"/>
+          <w:sz w:val="14"/>
+        </w:rPr>
+        <w:t>Gambar: Mitra — assets/ba/06-mitra.png</w:t>
       </w:r>
     </w:p>
     <w:p>
@@ -6495,6 +6866,59 @@
     </w:p>
     <w:p>
       <w:pPr>
+        <w:jc w:val="center"/>
+      </w:pPr>
+      <w:r>
+        <w:drawing>
+          <wp:inline xmlns:a="http://schemas.openxmlformats.org/drawingml/2006/main" xmlns:pic="http://schemas.openxmlformats.org/drawingml/2006/picture">
+            <wp:extent cx="5486400" cy="4457700"/>
+            <wp:docPr id="8" name="Picture 8"/>
+            <wp:cNvGraphicFramePr>
+              <a:graphicFrameLocks noChangeAspect="1"/>
+            </wp:cNvGraphicFramePr>
+            <a:graphic>
+              <a:graphicData uri="http://schemas.openxmlformats.org/drawingml/2006/picture">
+                <pic:pic>
+                  <pic:nvPicPr>
+                    <pic:cNvPr id="0" name="07-manage-product.png"/>
+                    <pic:cNvPicPr/>
+                  </pic:nvPicPr>
+                  <pic:blipFill>
+                    <a:blip r:embed="rId16"/>
+                    <a:stretch>
+                      <a:fillRect/>
+                    </a:stretch>
+                  </pic:blipFill>
+                  <pic:spPr>
+                    <a:xfrm>
+                      <a:off x="0" y="0"/>
+                      <a:ext cx="5486400" cy="4457700"/>
+                    </a:xfrm>
+                    <a:prstGeom prst="rect"/>
+                  </pic:spPr>
+                </pic:pic>
+              </a:graphicData>
+            </a:graphic>
+          </wp:inline>
+        </w:drawing>
+      </w:r>
+    </w:p>
+    <w:p>
+      <w:pPr>
+        <w:spacing w:after="120"/>
+        <w:jc w:val="center"/>
+      </w:pPr>
+      <w:r>
+        <w:rPr>
+          <w:i/>
+          <w:color w:val="666666"/>
+          <w:sz w:val="14"/>
+        </w:rPr>
+        <w:t>Gambar: Manage Product — assets/ba/07-manage-product.png</w:t>
+      </w:r>
+    </w:p>
+    <w:p>
+      <w:pPr>
         <w:pStyle w:val="ListBullet"/>
       </w:pPr>
       <w:r>
@@ -6552,6 +6976,59 @@
     </w:p>
     <w:p>
       <w:pPr>
+        <w:jc w:val="center"/>
+      </w:pPr>
+      <w:r>
+        <w:drawing>
+          <wp:inline xmlns:a="http://schemas.openxmlformats.org/drawingml/2006/main" xmlns:pic="http://schemas.openxmlformats.org/drawingml/2006/picture">
+            <wp:extent cx="5486400" cy="4093369"/>
+            <wp:docPr id="9" name="Picture 9"/>
+            <wp:cNvGraphicFramePr>
+              <a:graphicFrameLocks noChangeAspect="1"/>
+            </wp:cNvGraphicFramePr>
+            <a:graphic>
+              <a:graphicData uri="http://schemas.openxmlformats.org/drawingml/2006/picture">
+                <pic:pic>
+                  <pic:nvPicPr>
+                    <pic:cNvPr id="0" name="08-manage-role.png"/>
+                    <pic:cNvPicPr/>
+                  </pic:nvPicPr>
+                  <pic:blipFill>
+                    <a:blip r:embed="rId17"/>
+                    <a:stretch>
+                      <a:fillRect/>
+                    </a:stretch>
+                  </pic:blipFill>
+                  <pic:spPr>
+                    <a:xfrm>
+                      <a:off x="0" y="0"/>
+                      <a:ext cx="5486400" cy="4093369"/>
+                    </a:xfrm>
+                    <a:prstGeom prst="rect"/>
+                  </pic:spPr>
+                </pic:pic>
+              </a:graphicData>
+            </a:graphic>
+          </wp:inline>
+        </w:drawing>
+      </w:r>
+    </w:p>
+    <w:p>
+      <w:pPr>
+        <w:spacing w:after="120"/>
+        <w:jc w:val="center"/>
+      </w:pPr>
+      <w:r>
+        <w:rPr>
+          <w:i/>
+          <w:color w:val="666666"/>
+          <w:sz w:val="14"/>
+        </w:rPr>
+        <w:t>Gambar: Manage Role — assets/ba/08-manage-role.png</w:t>
+      </w:r>
+    </w:p>
+    <w:p>
+      <w:pPr>
         <w:pStyle w:val="ListBullet"/>
       </w:pPr>
       <w:r>
@@ -6598,6 +7075,59 @@
     </w:p>
     <w:p>
       <w:pPr>
+        <w:jc w:val="center"/>
+      </w:pPr>
+      <w:r>
+        <w:drawing>
+          <wp:inline xmlns:a="http://schemas.openxmlformats.org/drawingml/2006/main" xmlns:pic="http://schemas.openxmlformats.org/drawingml/2006/picture">
+            <wp:extent cx="5486400" cy="4389120"/>
+            <wp:docPr id="10" name="Picture 10"/>
+            <wp:cNvGraphicFramePr>
+              <a:graphicFrameLocks noChangeAspect="1"/>
+            </wp:cNvGraphicFramePr>
+            <a:graphic>
+              <a:graphicData uri="http://schemas.openxmlformats.org/drawingml/2006/picture">
+                <pic:pic>
+                  <pic:nvPicPr>
+                    <pic:cNvPr id="0" name="09-monitoring.png"/>
+                    <pic:cNvPicPr/>
+                  </pic:nvPicPr>
+                  <pic:blipFill>
+                    <a:blip r:embed="rId18"/>
+                    <a:stretch>
+                      <a:fillRect/>
+                    </a:stretch>
+                  </pic:blipFill>
+                  <pic:spPr>
+                    <a:xfrm>
+                      <a:off x="0" y="0"/>
+                      <a:ext cx="5486400" cy="4389120"/>
+                    </a:xfrm>
+                    <a:prstGeom prst="rect"/>
+                  </pic:spPr>
+                </pic:pic>
+              </a:graphicData>
+            </a:graphic>
+          </wp:inline>
+        </w:drawing>
+      </w:r>
+    </w:p>
+    <w:p>
+      <w:pPr>
+        <w:spacing w:after="120"/>
+        <w:jc w:val="center"/>
+      </w:pPr>
+      <w:r>
+        <w:rPr>
+          <w:i/>
+          <w:color w:val="666666"/>
+          <w:sz w:val="14"/>
+        </w:rPr>
+        <w:t>Gambar: Monitoring — assets/ba/09-monitoring.png</w:t>
+      </w:r>
+    </w:p>
+    <w:p>
+      <w:pPr>
         <w:pStyle w:val="ListBullet"/>
       </w:pPr>
       <w:r>
@@ -6629,6 +7159,59 @@
           <w:sz w:val="20"/>
         </w:rPr>
         <w:t>8.11 Rekap Transaksi</w:t>
+      </w:r>
+    </w:p>
+    <w:p>
+      <w:pPr>
+        <w:jc w:val="center"/>
+      </w:pPr>
+      <w:r>
+        <w:drawing>
+          <wp:inline xmlns:a="http://schemas.openxmlformats.org/drawingml/2006/main" xmlns:pic="http://schemas.openxmlformats.org/drawingml/2006/picture">
+            <wp:extent cx="5486400" cy="3789045"/>
+            <wp:docPr id="11" name="Picture 11"/>
+            <wp:cNvGraphicFramePr>
+              <a:graphicFrameLocks noChangeAspect="1"/>
+            </wp:cNvGraphicFramePr>
+            <a:graphic>
+              <a:graphicData uri="http://schemas.openxmlformats.org/drawingml/2006/picture">
+                <pic:pic>
+                  <pic:nvPicPr>
+                    <pic:cNvPr id="0" name="10-rekap.png"/>
+                    <pic:cNvPicPr/>
+                  </pic:nvPicPr>
+                  <pic:blipFill>
+                    <a:blip r:embed="rId19"/>
+                    <a:stretch>
+                      <a:fillRect/>
+                    </a:stretch>
+                  </pic:blipFill>
+                  <pic:spPr>
+                    <a:xfrm>
+                      <a:off x="0" y="0"/>
+                      <a:ext cx="5486400" cy="3789045"/>
+                    </a:xfrm>
+                    <a:prstGeom prst="rect"/>
+                  </pic:spPr>
+                </pic:pic>
+              </a:graphicData>
+            </a:graphic>
+          </wp:inline>
+        </w:drawing>
+      </w:r>
+    </w:p>
+    <w:p>
+      <w:pPr>
+        <w:spacing w:after="120"/>
+        <w:jc w:val="center"/>
+      </w:pPr>
+      <w:r>
+        <w:rPr>
+          <w:i/>
+          <w:color w:val="666666"/>
+          <w:sz w:val="14"/>
+        </w:rPr>
+        <w:t>Gambar: Rekap — assets/ba/10-rekap.png</w:t>
       </w:r>
     </w:p>
     <w:p>
@@ -6668,6 +7251,59 @@
     </w:p>
     <w:p>
       <w:pPr>
+        <w:jc w:val="center"/>
+      </w:pPr>
+      <w:r>
+        <w:drawing>
+          <wp:inline xmlns:a="http://schemas.openxmlformats.org/drawingml/2006/main" xmlns:pic="http://schemas.openxmlformats.org/drawingml/2006/picture">
+            <wp:extent cx="5486400" cy="3900488"/>
+            <wp:docPr id="12" name="Picture 12"/>
+            <wp:cNvGraphicFramePr>
+              <a:graphicFrameLocks noChangeAspect="1"/>
+            </wp:cNvGraphicFramePr>
+            <a:graphic>
+              <a:graphicData uri="http://schemas.openxmlformats.org/drawingml/2006/picture">
+                <pic:pic>
+                  <pic:nvPicPr>
+                    <pic:cNvPr id="0" name="11-rekonsiliasi-goto.png"/>
+                    <pic:cNvPicPr/>
+                  </pic:nvPicPr>
+                  <pic:blipFill>
+                    <a:blip r:embed="rId20"/>
+                    <a:stretch>
+                      <a:fillRect/>
+                    </a:stretch>
+                  </pic:blipFill>
+                  <pic:spPr>
+                    <a:xfrm>
+                      <a:off x="0" y="0"/>
+                      <a:ext cx="5486400" cy="3900488"/>
+                    </a:xfrm>
+                    <a:prstGeom prst="rect"/>
+                  </pic:spPr>
+                </pic:pic>
+              </a:graphicData>
+            </a:graphic>
+          </wp:inline>
+        </w:drawing>
+      </w:r>
+    </w:p>
+    <w:p>
+      <w:pPr>
+        <w:spacing w:after="120"/>
+        <w:jc w:val="center"/>
+      </w:pPr>
+      <w:r>
+        <w:rPr>
+          <w:i/>
+          <w:color w:val="666666"/>
+          <w:sz w:val="14"/>
+        </w:rPr>
+        <w:t>Gambar: Rekonsiliasi — assets/ba/11-rekonsiliasi-goto.png</w:t>
+      </w:r>
+    </w:p>
+    <w:p>
+      <w:pPr>
         <w:pStyle w:val="ListBullet"/>
       </w:pPr>
       <w:r>
@@ -6699,6 +7335,59 @@
           <w:sz w:val="20"/>
         </w:rPr>
         <w:t>8.13 Invoice</w:t>
+      </w:r>
+    </w:p>
+    <w:p>
+      <w:pPr>
+        <w:jc w:val="center"/>
+      </w:pPr>
+      <w:r>
+        <w:drawing>
+          <wp:inline xmlns:a="http://schemas.openxmlformats.org/drawingml/2006/main" xmlns:pic="http://schemas.openxmlformats.org/drawingml/2006/picture">
+            <wp:extent cx="5486400" cy="4354830"/>
+            <wp:docPr id="13" name="Picture 13"/>
+            <wp:cNvGraphicFramePr>
+              <a:graphicFrameLocks noChangeAspect="1"/>
+            </wp:cNvGraphicFramePr>
+            <a:graphic>
+              <a:graphicData uri="http://schemas.openxmlformats.org/drawingml/2006/picture">
+                <pic:pic>
+                  <pic:nvPicPr>
+                    <pic:cNvPr id="0" name="12-invoice.png"/>
+                    <pic:cNvPicPr/>
+                  </pic:nvPicPr>
+                  <pic:blipFill>
+                    <a:blip r:embed="rId21"/>
+                    <a:stretch>
+                      <a:fillRect/>
+                    </a:stretch>
+                  </pic:blipFill>
+                  <pic:spPr>
+                    <a:xfrm>
+                      <a:off x="0" y="0"/>
+                      <a:ext cx="5486400" cy="4354830"/>
+                    </a:xfrm>
+                    <a:prstGeom prst="rect"/>
+                  </pic:spPr>
+                </pic:pic>
+              </a:graphicData>
+            </a:graphic>
+          </wp:inline>
+        </w:drawing>
+      </w:r>
+    </w:p>
+    <w:p>
+      <w:pPr>
+        <w:spacing w:after="120"/>
+        <w:jc w:val="center"/>
+      </w:pPr>
+      <w:r>
+        <w:rPr>
+          <w:i/>
+          <w:color w:val="666666"/>
+          <w:sz w:val="14"/>
+        </w:rPr>
+        <w:t>Gambar: Invoice — assets/ba/12-invoice.png</w:t>
       </w:r>
     </w:p>
     <w:p>

</xml_diff>